<commit_message>
Completar símbolos, unidades e aplicação das 61 equações
Atualiza os cinco quadros Word e a rastreabilidade no código, preservando fórmulas, IDs, modelos, dados e resultados.
</commit_message>
<xml_diff>
--- a/docs/equacoes/Inventario_Geral_Equacoes_SPGER0046.docx
+++ b/docs/equacoes/Inventario_Geral_Equacoes_SPGER0046.docx
@@ -17,12 +17,17 @@
     </w:p>
     <w:p>
       <w:r>
-        <w:t>Este inventário organiza 61 relações numeradas: 37 do núcleo já escrito no notebook e 24 de apoio, verificadas no código. Usar a coluna de inserção para distribuir a redação e manter os IDs nas referências cruzadas.</w:t>
+        <w:t>Este inventário organiza 61 relações numeradas: 37 escritas nas células de método do notebook e 24 complementares explicitadas a partir do código. Usar a coluna de inserção para distribuir a redação e manter os IDs nas referências cruzadas.</w:t>
       </w:r>
     </w:p>
     <w:p>
       <w:r>
-        <w:t>Cada linha conta uma relação. Constantes e parâmetros não entram nessa contagem. Os itens N constituem o núcleo de inserção; os itens C detalham o método e podem ser incluídos conforme o espaço e a discussão da subseção. A numeração final do capítulo será definida na consolidação.</w:t>
+        <w:t>A coluna de aplicação distingue conversão principal, tratamento, avaliação, fundamentação, ilustrações e cenários. N e C indicam onde a relação foi registrada e não separam modelos físicos de cenários. Cada símbolo recebe descrição e unidade na própria linha; 1 indica adimensional.</w:t>
+      </w:r>
+    </w:p>
+    <w:p>
+      <w:r>
+        <w:t>O modelo A converte POA medida e meteorologia local por atenuação assumida, Faiman, CEC de diodo único, perdas CC, inversor PVWatts e perdas CA. A transposição exploratória, a aproximação CC PVWatts, o ajuste empírico e o balanço BIPV são identificados em suas respectivas aplicações.</w:t>
       </w:r>
     </w:p>
     <w:tbl>
@@ -65,6 +70,7 @@
           </w:tcPr>
           <w:p>
             <w:pPr>
+              <w:keepNext/>
               <w:spacing w:after="40" w:before="0" w:line="240" w:lineRule="auto"/>
               <w:ind w:firstLine="0"/>
             </w:pPr>
@@ -87,6 +93,7 @@
           </w:tcPr>
           <w:p>
             <w:pPr>
+              <w:keepNext/>
               <w:spacing w:after="40" w:before="0" w:line="240" w:lineRule="auto"/>
               <w:ind w:firstLine="0"/>
               <w:jc w:val="center"/>
@@ -98,7 +105,7 @@
                 <w:color w:val="000000"/>
                 <w:sz w:val="24"/>
               </w:rPr>
-              <w:t>Núcleo N</w:t>
+              <w:t>Notebook N</w:t>
             </w:r>
           </w:p>
         </w:tc>
@@ -110,6 +117,7 @@
           </w:tcPr>
           <w:p>
             <w:pPr>
+              <w:keepNext/>
               <w:spacing w:after="40" w:before="0" w:line="240" w:lineRule="auto"/>
               <w:ind w:firstLine="0"/>
               <w:jc w:val="center"/>
@@ -121,7 +129,7 @@
                 <w:color w:val="000000"/>
                 <w:sz w:val="24"/>
               </w:rPr>
-              <w:t>Apoio C</w:t>
+              <w:t>Código C</w:t>
             </w:r>
           </w:p>
         </w:tc>
@@ -133,6 +141,7 @@
           </w:tcPr>
           <w:p>
             <w:pPr>
+              <w:keepNext/>
               <w:spacing w:after="40" w:before="0" w:line="240" w:lineRule="auto"/>
               <w:ind w:firstLine="0"/>
               <w:jc w:val="center"/>
@@ -605,6 +614,9 @@
       </w:r>
     </w:p>
     <w:p>
+      <w:pPr>
+        <w:keepNext/>
+      </w:pPr>
       <w:r>
         <w:t>Distribuição por subseção: 1.1 com 2 relações; 1.2 com 2 relações; 1.3 com 1 relação; 1.4 com 1 relação.</w:t>
       </w:r>
@@ -649,6 +661,7 @@
           </w:tcPr>
           <w:p>
             <w:pPr>
+              <w:keepNext/>
               <w:spacing w:after="40" w:before="0" w:line="240" w:lineRule="auto"/>
               <w:ind w:firstLine="0"/>
             </w:pPr>
@@ -671,6 +684,7 @@
           </w:tcPr>
           <w:p>
             <w:pPr>
+              <w:keepNext/>
               <w:spacing w:after="40" w:before="0" w:line="240" w:lineRule="auto"/>
               <w:ind w:firstLine="0"/>
             </w:pPr>
@@ -693,6 +707,7 @@
           </w:tcPr>
           <w:p>
             <w:pPr>
+              <w:keepNext/>
               <w:spacing w:after="40" w:before="0" w:line="240" w:lineRule="auto"/>
               <w:ind w:firstLine="0"/>
             </w:pPr>
@@ -703,7 +718,7 @@
                 <w:color w:val="000000"/>
                 <w:sz w:val="24"/>
               </w:rPr>
-              <w:t>Função e símbolos</w:t>
+              <w:t>Função e símbolos com unidades</w:t>
             </w:r>
           </w:p>
         </w:tc>
@@ -715,6 +730,7 @@
           </w:tcPr>
           <w:p>
             <w:pPr>
+              <w:keepNext/>
               <w:spacing w:after="40" w:before="0" w:line="240" w:lineRule="auto"/>
               <w:ind w:firstLine="0"/>
             </w:pPr>
@@ -725,7 +741,7 @@
                 <w:color w:val="000000"/>
                 <w:sz w:val="24"/>
               </w:rPr>
-              <w:t>Origem e uso</w:t>
+              <w:t>Registro e aplicação</w:t>
             </w:r>
           </w:p>
         </w:tc>
@@ -946,7 +962,7 @@
                 <w:color w:val="000000"/>
                 <w:sz w:val="24"/>
               </w:rPr>
-              <w:t>φ latitude; δ declinação; ω ângulo horário; θz zênite.</w:t>
+              <w:t>θz: ângulo zenital solar [°]; φ: latitude do local [°]; δ: declinação solar [°]; ω: ângulo horário solar [°].</w:t>
             </w:r>
           </w:p>
         </w:tc>
@@ -966,8 +982,22 @@
                 <w:color w:val="000000"/>
                 <w:sz w:val="24"/>
               </w:rPr>
-              <w:t>N Núcleo do notebook</w:t>
+              <w:t>N Fórmula no notebook</w:t>
               <w:br/>
+              <w:t>Fundamentação ou exemplo geométrico</w:t>
+            </w:r>
+          </w:p>
+          <w:p>
+            <w:pPr>
+              <w:spacing w:after="40" w:before="0" w:line="240" w:lineRule="auto"/>
+              <w:ind w:firstLine="0"/>
+            </w:pPr>
+            <w:r>
+              <w:rPr>
+                <w:rFonts w:ascii="Times New Roman" w:hAnsi="Times New Roman"/>
+                <w:color w:val="000000"/>
+                <w:sz w:val="24"/>
+              </w:rPr>
               <w:t>R03, R04, R05</w:t>
             </w:r>
           </w:p>
@@ -1185,7 +1215,7 @@
                 <w:color w:val="000000"/>
                 <w:sz w:val="24"/>
               </w:rPr>
-              <w:t>G0n e G0h em W/m².</w:t>
+              <w:t>G0h: irradiância extraterrestre horizontal [W/m²]; G0n: irradiância extraterrestre normal [W/m²]; θz: ângulo zenital solar [°].</w:t>
             </w:r>
           </w:p>
         </w:tc>
@@ -1205,8 +1235,22 @@
                 <w:color w:val="000000"/>
                 <w:sz w:val="24"/>
               </w:rPr>
-              <w:t>N Núcleo do notebook</w:t>
+              <w:t>N Fórmula no notebook</w:t>
               <w:br/>
+              <w:t>Geometria calculada e seleção de intervalos</w:t>
+            </w:r>
+          </w:p>
+          <w:p>
+            <w:pPr>
+              <w:spacing w:after="40" w:before="0" w:line="240" w:lineRule="auto"/>
+              <w:ind w:firstLine="0"/>
+            </w:pPr>
+            <w:r>
+              <w:rPr>
+                <w:rFonts w:ascii="Times New Roman" w:hAnsi="Times New Roman"/>
+                <w:color w:val="000000"/>
+                <w:sz w:val="24"/>
+              </w:rPr>
               <w:t>R03, R04, R05</w:t>
             </w:r>
           </w:p>
@@ -1443,7 +1487,7 @@
                 <w:color w:val="000000"/>
                 <w:sz w:val="24"/>
               </w:rPr>
-              <w:t>GHI DNI e DHI em W/m².</w:t>
+              <w:t>GHI: irradiância global horizontal [W/m²]; DNI: irradiância direta normal aos raios [W/m²]; θz: ângulo zenital solar [°]; DHI: irradiância difusa horizontal [W/m²].</w:t>
             </w:r>
           </w:p>
         </w:tc>
@@ -1463,8 +1507,22 @@
                 <w:color w:val="000000"/>
                 <w:sz w:val="24"/>
               </w:rPr>
-              <w:t>N Núcleo do notebook</w:t>
+              <w:t>N Fórmula no notebook</w:t>
               <w:br/>
+              <w:t>Fundamentação ou exemplo geométrico</w:t>
+            </w:r>
+          </w:p>
+          <w:p>
+            <w:pPr>
+              <w:spacing w:after="40" w:before="0" w:line="240" w:lineRule="auto"/>
+              <w:ind w:firstLine="0"/>
+            </w:pPr>
+            <w:r>
+              <w:rPr>
+                <w:rFonts w:ascii="Times New Roman" w:hAnsi="Times New Roman"/>
+                <w:color w:val="000000"/>
+                <w:sz w:val="24"/>
+              </w:rPr>
               <w:t>R01, R14, R18, R29</w:t>
             </w:r>
           </w:p>
@@ -1643,7 +1701,7 @@
                 <w:color w:val="000000"/>
                 <w:sz w:val="24"/>
               </w:rPr>
-              <w:t>G em W/m²; Δt em h; H em Wh/m²; dividir por 1000 para kWh/m².</w:t>
+              <w:t>H: irradiação acumulada no plano e período [Wh/m²; /1000 → kWh/m²]; Gi: irradiância no intervalo i [W/m²]; Δti: duração do intervalo i; 0,25 h na série local [h]; i: índice do intervalo ou da observação na janela [1 (índice)].</w:t>
             </w:r>
           </w:p>
         </w:tc>
@@ -1663,8 +1721,22 @@
                 <w:color w:val="000000"/>
                 <w:sz w:val="24"/>
               </w:rPr>
-              <w:t>N Núcleo do notebook</w:t>
+              <w:t>N Fórmula no notebook</w:t>
               <w:br/>
+              <w:t>Integração ou estatística dos dados</w:t>
+            </w:r>
+          </w:p>
+          <w:p>
+            <w:pPr>
+              <w:spacing w:after="40" w:before="0" w:line="240" w:lineRule="auto"/>
+              <w:ind w:firstLine="0"/>
+            </w:pPr>
+            <w:r>
+              <w:rPr>
+                <w:rFonts w:ascii="Times New Roman" w:hAnsi="Times New Roman"/>
+                <w:color w:val="000000"/>
+                <w:sz w:val="24"/>
+              </w:rPr>
               <w:t>R01, R14, R18, R29</w:t>
             </w:r>
           </w:p>
@@ -1769,34 +1841,64 @@
                       <m:grow/>
                     </m:dPr>
                     <m:e>
-                      <m:d>
-                        <m:dPr>
-                          <m:begChr m:val="|"/>
-                          <m:endChr m:val="|"/>
-                          <m:sepChr m:val=""/>
-                          <m:grow/>
-                        </m:dPr>
+                      <m:r>
+                        <w:rPr>
+                          <w:rFonts w:ascii="Cambria Math" w:hAnsi="Cambria Math"/>
+                          <w:sz w:val="26"/>
+                        </w:rPr>
+                        <m:rPr>
+                          <m:sty m:val="p"/>
+                        </m:rPr>
+                        <m:t>|</m:t>
+                      </m:r>
+                      <m:sSub>
                         <m:e>
-                          <m:sSub>
-                            <m:e>
-                              <m:r>
-                                <w:rPr>
-                                  <w:rFonts w:ascii="Cambria Math" w:hAnsi="Cambria Math"/>
-                                  <w:sz w:val="26"/>
-                                </w:rPr>
-                                <m:t>G</m:t>
-                              </m:r>
-                            </m:e>
-                            <m:sub>
-                              <m:r>
-                                <w:rPr>
-                                  <w:rFonts w:ascii="Cambria Math" w:hAnsi="Cambria Math"/>
-                                  <w:sz w:val="26"/>
-                                </w:rPr>
-                                <m:t>i</m:t>
-                              </m:r>
-                            </m:sub>
-                          </m:sSub>
+                          <m:r>
+                            <w:rPr>
+                              <w:rFonts w:ascii="Cambria Math" w:hAnsi="Cambria Math"/>
+                              <w:sz w:val="26"/>
+                            </w:rPr>
+                            <m:t>G</m:t>
+                          </m:r>
+                        </m:e>
+                        <m:sub>
+                          <m:r>
+                            <w:rPr>
+                              <w:rFonts w:ascii="Cambria Math" w:hAnsi="Cambria Math"/>
+                              <w:sz w:val="26"/>
+                            </w:rPr>
+                            <m:t>i</m:t>
+                          </m:r>
+                        </m:sub>
+                      </m:sSub>
+                      <m:r>
+                        <w:rPr>
+                          <w:rFonts w:ascii="Cambria Math" w:hAnsi="Cambria Math"/>
+                          <w:sz w:val="26"/>
+                        </w:rPr>
+                        <m:rPr>
+                          <m:sty m:val="p"/>
+                        </m:rPr>
+                        <m:t>−</m:t>
+                      </m:r>
+                      <m:sSub>
+                        <m:e>
+                          <m:r>
+                            <w:rPr>
+                              <w:rFonts w:ascii="Cambria Math" w:hAnsi="Cambria Math"/>
+                              <w:sz w:val="26"/>
+                            </w:rPr>
+                            <m:t>G</m:t>
+                          </m:r>
+                        </m:e>
+                        <m:sub>
+                          <m:r>
+                            <w:rPr>
+                              <w:rFonts w:ascii="Cambria Math" w:hAnsi="Cambria Math"/>
+                              <w:sz w:val="26"/>
+                            </w:rPr>
+                            <m:t>i</m:t>
+                          </m:r>
                           <m:r>
                             <w:rPr>
                               <w:rFonts w:ascii="Cambria Math" w:hAnsi="Cambria Math"/>
@@ -1807,45 +1909,25 @@
                             </m:rPr>
                             <m:t>−</m:t>
                           </m:r>
-                          <m:sSub>
-                            <m:e>
-                              <m:r>
-                                <w:rPr>
-                                  <w:rFonts w:ascii="Cambria Math" w:hAnsi="Cambria Math"/>
-                                  <w:sz w:val="26"/>
-                                </w:rPr>
-                                <m:t>G</m:t>
-                              </m:r>
-                            </m:e>
-                            <m:sub>
-                              <m:r>
-                                <w:rPr>
-                                  <w:rFonts w:ascii="Cambria Math" w:hAnsi="Cambria Math"/>
-                                  <w:sz w:val="26"/>
-                                </w:rPr>
-                                <m:t>i</m:t>
-                              </m:r>
-                              <m:r>
-                                <w:rPr>
-                                  <w:rFonts w:ascii="Cambria Math" w:hAnsi="Cambria Math"/>
-                                  <w:sz w:val="26"/>
-                                </w:rPr>
-                                <m:rPr>
-                                  <m:sty m:val="p"/>
-                                </m:rPr>
-                                <m:t>−</m:t>
-                              </m:r>
-                              <m:r>
-                                <w:rPr>
-                                  <w:rFonts w:ascii="Cambria Math" w:hAnsi="Cambria Math"/>
-                                  <w:sz w:val="26"/>
-                                </w:rPr>
-                                <m:t>1</m:t>
-                              </m:r>
-                            </m:sub>
-                          </m:sSub>
-                        </m:e>
-                      </m:d>
+                          <m:r>
+                            <w:rPr>
+                              <w:rFonts w:ascii="Cambria Math" w:hAnsi="Cambria Math"/>
+                              <w:sz w:val="26"/>
+                            </w:rPr>
+                            <m:t>1</m:t>
+                          </m:r>
+                        </m:sub>
+                      </m:sSub>
+                      <m:r>
+                        <w:rPr>
+                          <w:rFonts w:ascii="Cambria Math" w:hAnsi="Cambria Math"/>
+                          <w:sz w:val="26"/>
+                        </w:rPr>
+                        <m:rPr>
+                          <m:sty m:val="p"/>
+                        </m:rPr>
+                        <m:t>|</m:t>
+                      </m:r>
                     </m:e>
                   </m:d>
                 </m:num>
@@ -1934,7 +2016,7 @@
                 <w:color w:val="000000"/>
                 <w:sz w:val="24"/>
               </w:rPr>
-              <w:t>Gi POA dos pares válidos ordenados do dia; resultado adimensional.</w:t>
+              <w:t>VΔG: passo absoluto médio relativo da irradiância [1 (adimensional)]; Gi: irradiância no intervalo i [W/m²]; Gi−1: irradiância do par disponível anterior [W/m²]; i: índice do intervalo ou da observação na janela [1 (índice)].</w:t>
             </w:r>
           </w:p>
         </w:tc>
@@ -1954,8 +2036,22 @@
                 <w:color w:val="000000"/>
                 <w:sz w:val="24"/>
               </w:rPr>
-              <w:t>N Núcleo do notebook</w:t>
+              <w:t>N Fórmula no notebook</w:t>
               <w:br/>
+              <w:t>Integração ou estatística dos dados</w:t>
+            </w:r>
+          </w:p>
+          <w:p>
+            <w:pPr>
+              <w:spacing w:after="40" w:before="0" w:line="240" w:lineRule="auto"/>
+              <w:ind w:firstLine="0"/>
+            </w:pPr>
+            <w:r>
+              <w:rPr>
+                <w:rFonts w:ascii="Times New Roman" w:hAnsi="Times New Roman"/>
+                <w:color w:val="000000"/>
+                <w:sz w:val="24"/>
+              </w:rPr>
               <w:t>R01, R25</w:t>
             </w:r>
           </w:p>
@@ -2249,7 +2345,7 @@
                 <w:color w:val="000000"/>
                 <w:sz w:val="24"/>
               </w:rPr>
-              <w:t>Npares e Nesperados na mesma janela; C em %.</w:t>
+              <w:t>C: cobertura dos dados na janela [%]; Npares: intervalos com dados válidos pareados [1 (contagem)]; Nesperados: intervalos esperados na mesma janela [1 (contagem)].</w:t>
             </w:r>
           </w:p>
         </w:tc>
@@ -2269,8 +2365,22 @@
                 <w:color w:val="000000"/>
                 <w:sz w:val="24"/>
               </w:rPr>
-              <w:t>N Núcleo do notebook</w:t>
+              <w:t>N Fórmula no notebook</w:t>
               <w:br/>
+              <w:t>Integração ou estatística dos dados</w:t>
+            </w:r>
+          </w:p>
+          <w:p>
+            <w:pPr>
+              <w:spacing w:after="40" w:before="0" w:line="240" w:lineRule="auto"/>
+              <w:ind w:firstLine="0"/>
+            </w:pPr>
+            <w:r>
+              <w:rPr>
+                <w:rFonts w:ascii="Times New Roman" w:hAnsi="Times New Roman"/>
+                <w:color w:val="000000"/>
+                <w:sz w:val="24"/>
+              </w:rPr>
               <w:t>R01, R02, R21, R22, R23, R25, R26</w:t>
             </w:r>
           </w:p>
@@ -2292,6 +2402,9 @@
       </w:r>
     </w:p>
     <w:p>
+      <w:pPr>
+        <w:keepNext/>
+      </w:pPr>
       <w:r>
         <w:t>Distribuição por subseção: 2.1 com 3 relações; 2.2 com 1 relação; 2.3 com 1 relação; 2.4 com 2 relações.</w:t>
       </w:r>
@@ -2341,6 +2454,7 @@
           </w:tcPr>
           <w:p>
             <w:pPr>
+              <w:keepNext/>
               <w:spacing w:after="40" w:before="0" w:line="240" w:lineRule="auto"/>
               <w:ind w:firstLine="0"/>
             </w:pPr>
@@ -2363,6 +2477,7 @@
           </w:tcPr>
           <w:p>
             <w:pPr>
+              <w:keepNext/>
               <w:spacing w:after="40" w:before="0" w:line="240" w:lineRule="auto"/>
               <w:ind w:firstLine="0"/>
             </w:pPr>
@@ -2385,6 +2500,7 @@
           </w:tcPr>
           <w:p>
             <w:pPr>
+              <w:keepNext/>
               <w:spacing w:after="40" w:before="0" w:line="240" w:lineRule="auto"/>
               <w:ind w:firstLine="0"/>
             </w:pPr>
@@ -2395,7 +2511,7 @@
                 <w:color w:val="000000"/>
                 <w:sz w:val="24"/>
               </w:rPr>
-              <w:t>Função e símbolos</w:t>
+              <w:t>Função e símbolos com unidades</w:t>
             </w:r>
           </w:p>
         </w:tc>
@@ -2407,6 +2523,7 @@
           </w:tcPr>
           <w:p>
             <w:pPr>
+              <w:keepNext/>
               <w:spacing w:after="40" w:before="0" w:line="240" w:lineRule="auto"/>
               <w:ind w:firstLine="0"/>
             </w:pPr>
@@ -2417,7 +2534,7 @@
                 <w:color w:val="000000"/>
                 <w:sz w:val="24"/>
               </w:rPr>
-              <w:t>Origem e uso</w:t>
+              <w:t>Registro e aplicação</w:t>
             </w:r>
           </w:p>
         </w:tc>
@@ -2615,7 +2732,7 @@
                 <w:color w:val="000000"/>
                 <w:sz w:val="24"/>
               </w:rPr>
-              <w:t>xi variável analisada; n pares; média na unidade de x.</w:t>
+              <w:t>x̄: média amostral da variável [unidade de x: °C, m/s, W/m² ou kW]; n: número de observações válidas da variável [1 (contagem)]; xi: observação da variável tabulada [unidade de x: °C, m/s, W/m² ou kW]; i: índice do intervalo ou da observação na janela [1 (índice)].</w:t>
             </w:r>
           </w:p>
         </w:tc>
@@ -2635,8 +2752,9 @@
                 <w:color w:val="000000"/>
                 <w:sz w:val="24"/>
               </w:rPr>
-              <w:t>C Apoio do código</w:t>
+              <w:t>C Relação do código</w:t>
               <w:br/>
+              <w:t>Integração ou estatística dos dados</w:t>
             </w:r>
           </w:p>
         </w:tc>
@@ -2905,7 +3023,7 @@
                 <w:color w:val="000000"/>
                 <w:sz w:val="24"/>
               </w:rPr>
-              <w:t>n maior que 1; sx na unidade de x.</w:t>
+              <w:t>sx: desvio padrão amostral de x [unidade de x: °C, m/s, W/m² ou kW]; n: número de observações válidas da variável [1 (contagem)]; xi: observação da variável tabulada [unidade de x: °C, m/s, W/m² ou kW]; x̄: média amostral da variável [unidade de x: °C, m/s, W/m² ou kW]; i: índice do intervalo ou da observação na janela [1 (índice)].</w:t>
             </w:r>
           </w:p>
         </w:tc>
@@ -2925,8 +3043,9 @@
                 <w:color w:val="000000"/>
                 <w:sz w:val="24"/>
               </w:rPr>
-              <w:t>C Apoio do código</w:t>
+              <w:t>C Relação do código</w:t>
               <w:br/>
+              <w:t>Integração ou estatística dos dados</w:t>
             </w:r>
           </w:p>
         </w:tc>
@@ -3093,7 +3212,7 @@
                 <w:color w:val="000000"/>
                 <w:sz w:val="24"/>
               </w:rPr>
-              <w:t>Q1 e Q3 quartis da mesma variável e janela.</w:t>
+              <w:t>IQR: amplitude interquartil de x [unidade de x: °C, m/s, W/m² ou kW]; Q3: terceiro quartil de x; percentil 75 [unidade de x: °C, m/s, W/m² ou kW]; Q1: primeiro quartil de x; percentil 25 [unidade de x: °C, m/s, W/m² ou kW].</w:t>
             </w:r>
           </w:p>
         </w:tc>
@@ -3113,8 +3232,9 @@
                 <w:color w:val="000000"/>
                 <w:sz w:val="24"/>
               </w:rPr>
-              <w:t>C Apoio do código</w:t>
+              <w:t>C Relação do código</w:t>
               <w:br/>
+              <w:t>Integração ou estatística dos dados</w:t>
             </w:r>
           </w:p>
         </w:tc>
@@ -3368,7 +3488,7 @@
                 <w:color w:val="000000"/>
                 <w:sz w:val="24"/>
               </w:rPr>
-              <w:t>ρg albedo; β inclinação; irradiâncias em W/m².</w:t>
+              <w:t>Gsolo: irradiância refletida pelo solo no plano [W/m²]; ρg: albedo assumido para o solo [1 (adimensional)]; GHI: irradiância global horizontal [W/m²]; β: inclinação do plano em relação à horizontal [°].</w:t>
             </w:r>
           </w:p>
         </w:tc>
@@ -3388,8 +3508,22 @@
                 <w:color w:val="000000"/>
                 <w:sz w:val="24"/>
               </w:rPr>
-              <w:t>N Núcleo do notebook</w:t>
+              <w:t>N Fórmula no notebook</w:t>
               <w:br/>
+              <w:t>Transposição exploratória e cenários</w:t>
+            </w:r>
+          </w:p>
+          <w:p>
+            <w:pPr>
+              <w:spacing w:after="40" w:before="0" w:line="240" w:lineRule="auto"/>
+              <w:ind w:firstLine="0"/>
+            </w:pPr>
+            <w:r>
+              <w:rPr>
+                <w:rFonts w:ascii="Times New Roman" w:hAnsi="Times New Roman"/>
+                <w:color w:val="000000"/>
+                <w:sz w:val="24"/>
+              </w:rPr>
               <w:t>R06, R14, R29</w:t>
             </w:r>
           </w:p>
@@ -3596,7 +3730,7 @@
                 <w:color w:val="000000"/>
                 <w:sz w:val="24"/>
               </w:rPr>
-              <w:t>s fração assumida entre 0 e 1; Gef e GPOA em W/m².</w:t>
+              <w:t>Gef: irradiância efetiva após atenuação assumida [W/m²]; s: fração de atenuação uniforme assumida [1 (adimensional)]; GPOA: irradiância no plano; medida no modelo principal [W/m²].</w:t>
             </w:r>
           </w:p>
         </w:tc>
@@ -3616,8 +3750,22 @@
                 <w:color w:val="000000"/>
                 <w:sz w:val="24"/>
               </w:rPr>
-              <w:t>N Núcleo do notebook</w:t>
+              <w:t>N Fórmula no notebook</w:t>
               <w:br/>
+              <w:t>Conversão física principal</w:t>
+            </w:r>
+          </w:p>
+          <w:p>
+            <w:pPr>
+              <w:spacing w:after="40" w:before="0" w:line="240" w:lineRule="auto"/>
+              <w:ind w:firstLine="0"/>
+            </w:pPr>
+            <w:r>
+              <w:rPr>
+                <w:rFonts w:ascii="Times New Roman" w:hAnsi="Times New Roman"/>
+                <w:color w:val="000000"/>
+                <w:sz w:val="24"/>
+              </w:rPr>
               <w:t>R28, R25</w:t>
             </w:r>
           </w:p>
@@ -3918,7 +4066,7 @@
                 <w:color w:val="000000"/>
                 <w:sz w:val="24"/>
               </w:rPr>
-              <w:t>β inclinação; γs e γa azimutes solar e do arranjo; θi incidência.</w:t>
+              <w:t>θi: ângulo entre os raios e a normal ao plano [°]; θz: ângulo zenital solar [°]; β: inclinação do plano em relação à horizontal [°]; γs: azimute solar a partir do norte no sentido horário [°]; γa: azimute do plano na mesma convenção [°].</w:t>
             </w:r>
           </w:p>
         </w:tc>
@@ -3938,8 +4086,22 @@
                 <w:color w:val="000000"/>
                 <w:sz w:val="24"/>
               </w:rPr>
-              <w:t>N Núcleo do notebook</w:t>
+              <w:t>N Fórmula no notebook</w:t>
               <w:br/>
+              <w:t>Geometria calculada e seleção de intervalos</w:t>
+            </w:r>
+          </w:p>
+          <w:p>
+            <w:pPr>
+              <w:spacing w:after="40" w:before="0" w:line="240" w:lineRule="auto"/>
+              <w:ind w:firstLine="0"/>
+            </w:pPr>
+            <w:r>
+              <w:rPr>
+                <w:rFonts w:ascii="Times New Roman" w:hAnsi="Times New Roman"/>
+                <w:color w:val="000000"/>
+                <w:sz w:val="24"/>
+              </w:rPr>
               <w:t>R03, R09, R29</w:t>
             </w:r>
           </w:p>
@@ -4093,7 +4255,7 @@
                 <w:color w:val="000000"/>
                 <w:sz w:val="24"/>
               </w:rPr>
-              <w:t>h altura; αs altura solar positiva; ℓ comprimento na unidade de h.</w:t>
+              <w:t>ℓ: comprimento horizontal da sombra do exemplo [m]; h: altura do obstáculo do exemplo [m]; αs: altura solar positiva acima do horizonte [°].</w:t>
             </w:r>
           </w:p>
         </w:tc>
@@ -4113,8 +4275,22 @@
                 <w:color w:val="000000"/>
                 <w:sz w:val="24"/>
               </w:rPr>
-              <w:t>N Núcleo do notebook</w:t>
+              <w:t>N Fórmula no notebook</w:t>
               <w:br/>
+              <w:t>Fundamentação ou exemplo geométrico</w:t>
+            </w:r>
+          </w:p>
+          <w:p>
+            <w:pPr>
+              <w:spacing w:after="40" w:before="0" w:line="240" w:lineRule="auto"/>
+              <w:ind w:firstLine="0"/>
+            </w:pPr>
+            <w:r>
+              <w:rPr>
+                <w:rFonts w:ascii="Times New Roman" w:hAnsi="Times New Roman"/>
+                <w:color w:val="000000"/>
+                <w:sz w:val="24"/>
+              </w:rPr>
               <w:t>R03, R09, R29</w:t>
             </w:r>
           </w:p>
@@ -4136,6 +4312,9 @@
       </w:r>
     </w:p>
     <w:p>
+      <w:pPr>
+        <w:keepNext/>
+      </w:pPr>
       <w:r>
         <w:t>Distribuição por subseção: 3.1 com 2 relações; 3.2 com 1 relação; 3.3 com 3 relações; 3.4 com 4 relações; 3.5 com 7 relações; 3.6 com 1 relação.</w:t>
       </w:r>
@@ -4180,6 +4359,7 @@
           </w:tcPr>
           <w:p>
             <w:pPr>
+              <w:keepNext/>
               <w:spacing w:after="40" w:before="0" w:line="240" w:lineRule="auto"/>
               <w:ind w:firstLine="0"/>
             </w:pPr>
@@ -4202,6 +4382,7 @@
           </w:tcPr>
           <w:p>
             <w:pPr>
+              <w:keepNext/>
               <w:spacing w:after="40" w:before="0" w:line="240" w:lineRule="auto"/>
               <w:ind w:firstLine="0"/>
             </w:pPr>
@@ -4224,6 +4405,7 @@
           </w:tcPr>
           <w:p>
             <w:pPr>
+              <w:keepNext/>
               <w:spacing w:after="40" w:before="0" w:line="240" w:lineRule="auto"/>
               <w:ind w:firstLine="0"/>
             </w:pPr>
@@ -4234,7 +4416,7 @@
                 <w:color w:val="000000"/>
                 <w:sz w:val="24"/>
               </w:rPr>
-              <w:t>Função e símbolos</w:t>
+              <w:t>Função e símbolos com unidades</w:t>
             </w:r>
           </w:p>
         </w:tc>
@@ -4246,6 +4428,7 @@
           </w:tcPr>
           <w:p>
             <w:pPr>
+              <w:keepNext/>
               <w:spacing w:after="40" w:before="0" w:line="240" w:lineRule="auto"/>
               <w:ind w:firstLine="0"/>
             </w:pPr>
@@ -4256,7 +4439,7 @@
                 <w:color w:val="000000"/>
                 <w:sz w:val="24"/>
               </w:rPr>
-              <w:t>Origem e uso</w:t>
+              <w:t>Registro e aplicação</w:t>
             </w:r>
           </w:p>
         </w:tc>
@@ -4599,7 +4782,7 @@
                 <w:color w:val="000000"/>
                 <w:sz w:val="24"/>
               </w:rPr>
-              <w:t>Gcéu e Gsolo no plano; todos os termos em W/m².</w:t>
+              <w:t>GPOA: irradiância no plano; medida no modelo principal [W/m²]; DNI: irradiância direta normal aos raios [W/m²]; θi: ângulo entre os raios e a normal ao plano [°]; Gcéu: irradiância difusa do céu no plano [W/m²]; Gsolo: irradiância refletida pelo solo no plano [W/m²].</w:t>
             </w:r>
           </w:p>
         </w:tc>
@@ -4619,8 +4802,22 @@
                 <w:color w:val="000000"/>
                 <w:sz w:val="24"/>
               </w:rPr>
-              <w:t>N Núcleo do notebook</w:t>
+              <w:t>N Fórmula no notebook</w:t>
               <w:br/>
+              <w:t>Transposição exploratória e cenários</w:t>
+            </w:r>
+          </w:p>
+          <w:p>
+            <w:pPr>
+              <w:spacing w:after="40" w:before="0" w:line="240" w:lineRule="auto"/>
+              <w:ind w:firstLine="0"/>
+            </w:pPr>
+            <w:r>
+              <w:rPr>
+                <w:rFonts w:ascii="Times New Roman" w:hAnsi="Times New Roman"/>
+                <w:color w:val="000000"/>
+                <w:sz w:val="24"/>
+              </w:rPr>
               <w:t>R06, R14, R15, R16, R18</w:t>
             </w:r>
           </w:p>
@@ -4956,7 +5153,7 @@
                 <w:color w:val="000000"/>
                 <w:sz w:val="24"/>
               </w:rPr>
-              <w:t>POA reconstruída e medida no mesmo intervalo; resíduo em W/m².</w:t>
+              <w:t>εPOA: resíduo de fechamento da reconstrução POA [W/m²]; GPOA,recon: POA reconstruída pela transposição [W/m²]; GPOA,med: POA medida no mesmo intervalo [W/m²].</w:t>
             </w:r>
           </w:p>
         </w:tc>
@@ -4976,8 +5173,22 @@
                 <w:color w:val="000000"/>
                 <w:sz w:val="24"/>
               </w:rPr>
-              <w:t>C Apoio do código</w:t>
+              <w:t>C Relação do código</w:t>
               <w:br/>
+              <w:t>Transposição exploratória e cenários</w:t>
+            </w:r>
+          </w:p>
+          <w:p>
+            <w:pPr>
+              <w:spacing w:after="40" w:before="0" w:line="240" w:lineRule="auto"/>
+              <w:ind w:firstLine="0"/>
+            </w:pPr>
+            <w:r>
+              <w:rPr>
+                <w:rFonts w:ascii="Times New Roman" w:hAnsi="Times New Roman"/>
+                <w:color w:val="000000"/>
+                <w:sz w:val="24"/>
+              </w:rPr>
               <w:t>R06, R14, R15, R16, R18</w:t>
             </w:r>
           </w:p>
@@ -5236,7 +5447,7 @@
                 <w:color w:val="000000"/>
                 <w:sz w:val="24"/>
               </w:rPr>
-              <w:t>Ta em °C; v em m/s; U0 e U1 coeficientes térmicos.</w:t>
+              <w:t>Top: temperatura operacional usada como aproximação da célula [°C]; Ta: temperatura do ar local [°C]; Gef: irradiância efetiva após atenuação assumida [W/m²]; U0: coeficiente térmico de Faiman independente do vento [W/(m²·K)]; U1: coeficiente térmico de Faiman associado ao vento [W·s/(m³·K)]; v: velocidade do vento medida [m/s].</w:t>
             </w:r>
           </w:p>
         </w:tc>
@@ -5256,8 +5467,22 @@
                 <w:color w:val="000000"/>
                 <w:sz w:val="24"/>
               </w:rPr>
-              <w:t>N Núcleo do notebook</w:t>
+              <w:t>N Fórmula no notebook</w:t>
               <w:br/>
+              <w:t>Conversão física principal</w:t>
+            </w:r>
+          </w:p>
+          <w:p>
+            <w:pPr>
+              <w:spacing w:after="40" w:before="0" w:line="240" w:lineRule="auto"/>
+              <w:ind w:firstLine="0"/>
+            </w:pPr>
+            <w:r>
+              <w:rPr>
+                <w:rFonts w:ascii="Times New Roman" w:hAnsi="Times New Roman"/>
+                <w:color w:val="000000"/>
+                <w:sz w:val="24"/>
+              </w:rPr>
               <w:t>R07</w:t>
             </w:r>
           </w:p>
@@ -5369,113 +5594,123 @@
                   </m:r>
                 </m:sub>
               </m:sSub>
+              <m:r>
+                <w:rPr>
+                  <w:rFonts w:ascii="Cambria Math" w:hAnsi="Cambria Math"/>
+                  <w:sz w:val="26"/>
+                </w:rPr>
+                <m:rPr>
+                  <m:sty m:val="p"/>
+                </m:rPr>
+                <m:t>[</m:t>
+              </m:r>
+              <m:r>
+                <w:rPr>
+                  <w:rFonts w:ascii="Cambria Math" w:hAnsi="Cambria Math"/>
+                  <w:sz w:val="26"/>
+                </w:rPr>
+                <m:rPr>
+                  <m:sty m:val="p"/>
+                </m:rPr>
+                <m:t>exp</m:t>
+              </m:r>
               <m:d>
                 <m:dPr>
-                  <m:begChr m:val="["/>
-                  <m:endChr m:val="]"/>
+                  <m:begChr m:val="("/>
+                  <m:endChr m:val=")"/>
                   <m:sepChr m:val=""/>
                   <m:grow/>
                 </m:dPr>
                 <m:e>
-                  <m:r>
-                    <w:rPr>
-                      <w:rFonts w:ascii="Cambria Math" w:hAnsi="Cambria Math"/>
-                      <w:sz w:val="26"/>
-                    </w:rPr>
-                    <m:rPr>
-                      <m:sty m:val="p"/>
-                    </m:rPr>
-                    <m:t>exp</m:t>
-                  </m:r>
-                  <m:d>
-                    <m:dPr>
-                      <m:begChr m:val="("/>
-                      <m:endChr m:val=")"/>
-                      <m:sepChr m:val=""/>
-                      <m:grow/>
-                    </m:dPr>
-                    <m:e>
-                      <m:f>
-                        <m:fPr>
-                          <m:type m:val="bar"/>
-                        </m:fPr>
-                        <m:num>
+                  <m:f>
+                    <m:fPr>
+                      <m:type m:val="bar"/>
+                    </m:fPr>
+                    <m:num>
+                      <m:r>
+                        <w:rPr>
+                          <w:rFonts w:ascii="Cambria Math" w:hAnsi="Cambria Math"/>
+                          <w:sz w:val="26"/>
+                        </w:rPr>
+                        <m:t>V</m:t>
+                      </m:r>
+                      <m:r>
+                        <w:rPr>
+                          <w:rFonts w:ascii="Cambria Math" w:hAnsi="Cambria Math"/>
+                          <w:sz w:val="26"/>
+                        </w:rPr>
+                        <m:rPr>
+                          <m:sty m:val="p"/>
+                        </m:rPr>
+                        <m:t>+</m:t>
+                      </m:r>
+                      <m:r>
+                        <w:rPr>
+                          <w:rFonts w:ascii="Cambria Math" w:hAnsi="Cambria Math"/>
+                          <w:sz w:val="26"/>
+                        </w:rPr>
+                        <m:t>I</m:t>
+                      </m:r>
+                      <m:sSub>
+                        <m:e>
                           <m:r>
                             <w:rPr>
                               <w:rFonts w:ascii="Cambria Math" w:hAnsi="Cambria Math"/>
                               <w:sz w:val="26"/>
                             </w:rPr>
-                            <m:t>V</m:t>
+                            <m:t>R</m:t>
                           </m:r>
+                        </m:e>
+                        <m:sub>
                           <m:r>
                             <w:rPr>
                               <w:rFonts w:ascii="Cambria Math" w:hAnsi="Cambria Math"/>
                               <w:sz w:val="26"/>
                             </w:rPr>
-                            <m:rPr>
-                              <m:sty m:val="p"/>
-                            </m:rPr>
-                            <m:t>+</m:t>
+                            <m:t>s</m:t>
                           </m:r>
-                          <m:r>
-                            <w:rPr>
-                              <w:rFonts w:ascii="Cambria Math" w:hAnsi="Cambria Math"/>
-                              <w:sz w:val="26"/>
-                            </w:rPr>
-                            <m:t>I</m:t>
-                          </m:r>
-                          <m:sSub>
-                            <m:e>
-                              <m:r>
-                                <w:rPr>
-                                  <w:rFonts w:ascii="Cambria Math" w:hAnsi="Cambria Math"/>
-                                  <w:sz w:val="26"/>
-                                </w:rPr>
-                                <m:t>R</m:t>
-                              </m:r>
-                            </m:e>
-                            <m:sub>
-                              <m:r>
-                                <w:rPr>
-                                  <w:rFonts w:ascii="Cambria Math" w:hAnsi="Cambria Math"/>
-                                  <w:sz w:val="26"/>
-                                </w:rPr>
-                                <m:t>s</m:t>
-                              </m:r>
-                            </m:sub>
-                          </m:sSub>
-                        </m:num>
-                        <m:den>
-                          <m:r>
-                            <w:rPr>
-                              <w:rFonts w:ascii="Cambria Math" w:hAnsi="Cambria Math"/>
-                              <w:sz w:val="26"/>
-                            </w:rPr>
-                            <m:t>a</m:t>
-                          </m:r>
-                        </m:den>
-                      </m:f>
-                    </m:e>
-                  </m:d>
-                  <m:r>
-                    <w:rPr>
-                      <w:rFonts w:ascii="Cambria Math" w:hAnsi="Cambria Math"/>
-                      <w:sz w:val="26"/>
-                    </w:rPr>
-                    <m:rPr>
-                      <m:sty m:val="p"/>
-                    </m:rPr>
-                    <m:t>−</m:t>
-                  </m:r>
-                  <m:r>
-                    <w:rPr>
-                      <w:rFonts w:ascii="Cambria Math" w:hAnsi="Cambria Math"/>
-                      <w:sz w:val="26"/>
-                    </w:rPr>
-                    <m:t>1</m:t>
-                  </m:r>
+                        </m:sub>
+                      </m:sSub>
+                    </m:num>
+                    <m:den>
+                      <m:r>
+                        <w:rPr>
+                          <w:rFonts w:ascii="Cambria Math" w:hAnsi="Cambria Math"/>
+                          <w:sz w:val="26"/>
+                        </w:rPr>
+                        <m:t>a</m:t>
+                      </m:r>
+                    </m:den>
+                  </m:f>
                 </m:e>
               </m:d>
+              <m:r>
+                <w:rPr>
+                  <w:rFonts w:ascii="Cambria Math" w:hAnsi="Cambria Math"/>
+                  <w:sz w:val="26"/>
+                </w:rPr>
+                <m:rPr>
+                  <m:sty m:val="p"/>
+                </m:rPr>
+                <m:t>−</m:t>
+              </m:r>
+              <m:r>
+                <w:rPr>
+                  <w:rFonts w:ascii="Cambria Math" w:hAnsi="Cambria Math"/>
+                  <w:sz w:val="26"/>
+                </w:rPr>
+                <m:t>1</m:t>
+              </m:r>
+              <m:r>
+                <w:rPr>
+                  <w:rFonts w:ascii="Cambria Math" w:hAnsi="Cambria Math"/>
+                  <w:sz w:val="26"/>
+                </w:rPr>
+                <m:rPr>
+                  <m:sty m:val="p"/>
+                </m:rPr>
+                <m:t>]</m:t>
+              </m:r>
               <m:r>
                 <w:rPr>
                   <w:rFonts w:ascii="Cambria Math" w:hAnsi="Cambria Math"/>
@@ -5608,7 +5843,7 @@
                 <w:color w:val="000000"/>
                 <w:sz w:val="24"/>
               </w:rPr>
-              <w:t>IL e I0 correntes; Rs e Rsh resistências; a fator em volts.</w:t>
+              <w:t>I: corrente elétrica do módulo [A]; IL: corrente fotogerada do modelo CEC [A]; I0: corrente de saturação do diodo [A]; V: tensão elétrica nos terminais do módulo [V]; Rs: resistência série do modelo [Ω]; a: fator de tensão térmica modificada do diodo [V]; Rsh: resistência paralela do modelo [Ω].</w:t>
             </w:r>
           </w:p>
         </w:tc>
@@ -5628,8 +5863,22 @@
                 <w:color w:val="000000"/>
                 <w:sz w:val="24"/>
               </w:rPr>
-              <w:t>N Núcleo do notebook</w:t>
+              <w:t>N Fórmula no notebook</w:t>
               <w:br/>
+              <w:t>Conversão física principal</w:t>
+            </w:r>
+          </w:p>
+          <w:p>
+            <w:pPr>
+              <w:spacing w:after="40" w:before="0" w:line="240" w:lineRule="auto"/>
+              <w:ind w:firstLine="0"/>
+            </w:pPr>
+            <w:r>
+              <w:rPr>
+                <w:rFonts w:ascii="Times New Roman" w:hAnsi="Times New Roman"/>
+                <w:color w:val="000000"/>
+                <w:sz w:val="24"/>
+              </w:rPr>
               <w:t>R08, R09, R10</w:t>
             </w:r>
           </w:p>
@@ -5747,7 +5996,7 @@
                 <w:color w:val="000000"/>
                 <w:sz w:val="24"/>
               </w:rPr>
-              <w:t>V em V; I em A; P em W.</w:t>
+              <w:t>P: potência elétrica do módulo [W]; V: tensão elétrica nos terminais do módulo [V]; I: corrente elétrica do módulo [A].</w:t>
             </w:r>
           </w:p>
         </w:tc>
@@ -5767,8 +6016,22 @@
                 <w:color w:val="000000"/>
                 <w:sz w:val="24"/>
               </w:rPr>
-              <w:t>N Núcleo do notebook</w:t>
+              <w:t>N Fórmula no notebook</w:t>
               <w:br/>
+              <w:t>Curvas ou associação elétrica ilustrativa</w:t>
+            </w:r>
+          </w:p>
+          <w:p>
+            <w:pPr>
+              <w:spacing w:after="40" w:before="0" w:line="240" w:lineRule="auto"/>
+              <w:ind w:firstLine="0"/>
+            </w:pPr>
+            <w:r>
+              <w:rPr>
+                <w:rFonts w:ascii="Times New Roman" w:hAnsi="Times New Roman"/>
+                <w:color w:val="000000"/>
+                <w:sz w:val="24"/>
+              </w:rPr>
               <w:t>R08, R09, R10</w:t>
             </w:r>
           </w:p>
@@ -5988,79 +6251,59 @@
                   </m:r>
                 </m:den>
               </m:f>
+              <m:r>
+                <w:rPr>
+                  <w:rFonts w:ascii="Cambria Math" w:hAnsi="Cambria Math"/>
+                  <w:sz w:val="26"/>
+                </w:rPr>
+                <m:rPr>
+                  <m:sty m:val="p"/>
+                </m:rPr>
+                <m:t>[</m:t>
+              </m:r>
+              <m:r>
+                <w:rPr>
+                  <w:rFonts w:ascii="Cambria Math" w:hAnsi="Cambria Math"/>
+                  <w:sz w:val="26"/>
+                </w:rPr>
+                <m:t>1</m:t>
+              </m:r>
+              <m:r>
+                <w:rPr>
+                  <w:rFonts w:ascii="Cambria Math" w:hAnsi="Cambria Math"/>
+                  <w:sz w:val="26"/>
+                </w:rPr>
+                <m:rPr>
+                  <m:sty m:val="p"/>
+                </m:rPr>
+                <m:t>+</m:t>
+              </m:r>
+              <m:r>
+                <w:rPr>
+                  <w:rFonts w:ascii="Cambria Math" w:hAnsi="Cambria Math"/>
+                  <w:sz w:val="26"/>
+                </w:rPr>
+                <m:t>γ</m:t>
+              </m:r>
               <m:d>
                 <m:dPr>
-                  <m:begChr m:val="["/>
-                  <m:endChr m:val="]"/>
+                  <m:begChr m:val="("/>
+                  <m:endChr m:val=")"/>
                   <m:sepChr m:val=""/>
                   <m:grow/>
                 </m:dPr>
                 <m:e>
-                  <m:r>
-                    <w:rPr>
-                      <w:rFonts w:ascii="Cambria Math" w:hAnsi="Cambria Math"/>
-                      <w:sz w:val="26"/>
-                    </w:rPr>
-                    <m:t>1</m:t>
-                  </m:r>
-                  <m:r>
-                    <w:rPr>
-                      <w:rFonts w:ascii="Cambria Math" w:hAnsi="Cambria Math"/>
-                      <w:sz w:val="26"/>
-                    </w:rPr>
-                    <m:rPr>
-                      <m:sty m:val="p"/>
-                    </m:rPr>
-                    <m:t>+</m:t>
-                  </m:r>
-                  <m:r>
-                    <w:rPr>
-                      <w:rFonts w:ascii="Cambria Math" w:hAnsi="Cambria Math"/>
-                      <w:sz w:val="26"/>
-                    </w:rPr>
-                    <m:t>γ</m:t>
-                  </m:r>
-                  <m:d>
-                    <m:dPr>
-                      <m:begChr m:val="("/>
-                      <m:endChr m:val=")"/>
-                      <m:sepChr m:val=""/>
-                      <m:grow/>
-                    </m:dPr>
+                  <m:sSub>
                     <m:e>
-                      <m:sSub>
-                        <m:e>
-                          <m:r>
-                            <w:rPr>
-                              <w:rFonts w:ascii="Cambria Math" w:hAnsi="Cambria Math"/>
-                              <w:sz w:val="26"/>
-                            </w:rPr>
-                            <m:t>T</m:t>
-                          </m:r>
-                        </m:e>
-                        <m:sub>
-                          <m:r>
-                            <w:rPr>
-                              <w:rFonts w:ascii="Cambria Math" w:hAnsi="Cambria Math"/>
-                              <w:sz w:val="26"/>
-                            </w:rPr>
-                            <m:rPr>
-                              <m:sty m:val="p"/>
-                            </m:rPr>
-                            <m:t>o</m:t>
-                          </m:r>
-                          <m:r>
-                            <w:rPr>
-                              <w:rFonts w:ascii="Cambria Math" w:hAnsi="Cambria Math"/>
-                              <w:sz w:val="26"/>
-                            </w:rPr>
-                            <m:rPr>
-                              <m:sty m:val="p"/>
-                            </m:rPr>
-                            <m:t>p</m:t>
-                          </m:r>
-                        </m:sub>
-                      </m:sSub>
+                      <m:r>
+                        <w:rPr>
+                          <w:rFonts w:ascii="Cambria Math" w:hAnsi="Cambria Math"/>
+                          <w:sz w:val="26"/>
+                        </w:rPr>
+                        <m:t>T</m:t>
+                      </m:r>
+                    </m:e>
+                    <m:sub>
                       <m:r>
                         <w:rPr>
                           <w:rFonts w:ascii="Cambria Math" w:hAnsi="Cambria Math"/>
@@ -6069,19 +6312,49 @@
                         <m:rPr>
                           <m:sty m:val="p"/>
                         </m:rPr>
-                        <m:t>−</m:t>
+                        <m:t>o</m:t>
                       </m:r>
                       <m:r>
                         <w:rPr>
                           <w:rFonts w:ascii="Cambria Math" w:hAnsi="Cambria Math"/>
                           <w:sz w:val="26"/>
                         </w:rPr>
-                        <m:t>25</m:t>
+                        <m:rPr>
+                          <m:sty m:val="p"/>
+                        </m:rPr>
+                        <m:t>p</m:t>
                       </m:r>
-                    </m:e>
-                  </m:d>
+                    </m:sub>
+                  </m:sSub>
+                  <m:r>
+                    <w:rPr>
+                      <w:rFonts w:ascii="Cambria Math" w:hAnsi="Cambria Math"/>
+                      <w:sz w:val="26"/>
+                    </w:rPr>
+                    <m:rPr>
+                      <m:sty m:val="p"/>
+                    </m:rPr>
+                    <m:t>−</m:t>
+                  </m:r>
+                  <m:r>
+                    <w:rPr>
+                      <w:rFonts w:ascii="Cambria Math" w:hAnsi="Cambria Math"/>
+                      <w:sz w:val="26"/>
+                    </w:rPr>
+                    <m:t>25</m:t>
+                  </m:r>
                 </m:e>
               </m:d>
+              <m:r>
+                <w:rPr>
+                  <w:rFonts w:ascii="Cambria Math" w:hAnsi="Cambria Math"/>
+                  <w:sz w:val="26"/>
+                </w:rPr>
+                <m:rPr>
+                  <m:sty m:val="p"/>
+                </m:rPr>
+                <m:t>]</m:t>
+              </m:r>
               <m:nary>
                 <m:naryPr>
                   <m:chr m:val="∏"/>
@@ -6202,7 +6475,7 @@
                 <w:color w:val="000000"/>
                 <w:sz w:val="24"/>
               </w:rPr>
-              <w:t>Gef em W/m²; γ em °C⁻¹; PSTC potência total dos módulos em W.</w:t>
+              <w:t>PDC,PVW: potência CC da comparação PVWatts após perdas [W]; PSTC: potência STC CEC do módulo multiplicada por 2880 [W]; Gef: irradiância efetiva após atenuação assumida [W/m²]; γ: coeficiente relativo de potência CEC; gamma_r/100 [°C⁻¹]; Top: temperatura operacional usada como aproximação da célula [°C]; ℓj: fração de perda CC de cabos, mismatch ou conexões [1 (adimensional)]; j: índice da hipótese de perda CC [1 (índice)].</w:t>
             </w:r>
           </w:p>
         </w:tc>
@@ -6222,8 +6495,22 @@
                 <w:color w:val="000000"/>
                 <w:sz w:val="24"/>
               </w:rPr>
-              <w:t>C Apoio do código</w:t>
+              <w:t>C Relação do código</w:t>
               <w:br/>
+              <w:t>Comparação CC auxiliar</w:t>
+            </w:r>
+          </w:p>
+          <w:p>
+            <w:pPr>
+              <w:spacing w:after="40" w:before="0" w:line="240" w:lineRule="auto"/>
+              <w:ind w:firstLine="0"/>
+            </w:pPr>
+            <w:r>
+              <w:rPr>
+                <w:rFonts w:ascii="Times New Roman" w:hAnsi="Times New Roman"/>
+                <w:color w:val="000000"/>
+                <w:sz w:val="24"/>
+              </w:rPr>
               <w:t>R11, R09</w:t>
             </w:r>
           </w:p>
@@ -6380,7 +6667,7 @@
                 <w:color w:val="000000"/>
                 <w:sz w:val="24"/>
               </w:rPr>
-              <w:t>Ns número em série; Vm tensão do módulo.</w:t>
+              <w:t>Va: tensão da associação equivalente [V]; Ns: módulos em série no exemplo; 20 [1 (contagem)]; Vm: tensão do módulo no ponto de máxima potência [V].</w:t>
             </w:r>
           </w:p>
         </w:tc>
@@ -6400,8 +6687,22 @@
                 <w:color w:val="000000"/>
                 <w:sz w:val="24"/>
               </w:rPr>
-              <w:t>N Núcleo do notebook</w:t>
+              <w:t>N Fórmula no notebook</w:t>
               <w:br/>
+              <w:t>Curvas ou associação elétrica ilustrativa</w:t>
+            </w:r>
+          </w:p>
+          <w:p>
+            <w:pPr>
+              <w:spacing w:after="40" w:before="0" w:line="240" w:lineRule="auto"/>
+              <w:ind w:firstLine="0"/>
+            </w:pPr>
+            <w:r>
+              <w:rPr>
+                <w:rFonts w:ascii="Times New Roman" w:hAnsi="Times New Roman"/>
+                <w:color w:val="000000"/>
+                <w:sz w:val="24"/>
+              </w:rPr>
               <w:t>R08, R10, R13</w:t>
             </w:r>
           </w:p>
@@ -6558,7 +6859,7 @@
                 <w:color w:val="000000"/>
                 <w:sz w:val="24"/>
               </w:rPr>
-              <w:t>Np strings em paralelo; Im corrente do módulo.</w:t>
+              <w:t>Ia: corrente da associação equivalente [A]; Np: strings em paralelo no exemplo; 6 [1 (contagem)]; Im: corrente do módulo no ponto de máxima potência [A].</w:t>
             </w:r>
           </w:p>
         </w:tc>
@@ -6578,8 +6879,22 @@
                 <w:color w:val="000000"/>
                 <w:sz w:val="24"/>
               </w:rPr>
-              <w:t>N Núcleo do notebook</w:t>
+              <w:t>N Fórmula no notebook</w:t>
               <w:br/>
+              <w:t>Curvas ou associação elétrica ilustrativa</w:t>
+            </w:r>
+          </w:p>
+          <w:p>
+            <w:pPr>
+              <w:spacing w:after="40" w:before="0" w:line="240" w:lineRule="auto"/>
+              <w:ind w:firstLine="0"/>
+            </w:pPr>
+            <w:r>
+              <w:rPr>
+                <w:rFonts w:ascii="Times New Roman" w:hAnsi="Times New Roman"/>
+                <w:color w:val="000000"/>
+                <w:sz w:val="24"/>
+              </w:rPr>
               <w:t>R08, R10, R13</w:t>
             </w:r>
           </w:p>
@@ -6756,7 +7071,7 @@
                 <w:color w:val="000000"/>
                 <w:sz w:val="24"/>
               </w:rPr>
-              <w:t>Pm potência do módulo; Pa em W.</w:t>
+              <w:t>Pa: potência da associação ilustrativa de 120 módulos [W]; Ns: módulos em série no exemplo; 20 [1 (contagem)]; Np: strings em paralelo no exemplo; 6 [1 (contagem)]; Pm: potência do módulo no ponto de máxima potência [W].</w:t>
             </w:r>
           </w:p>
         </w:tc>
@@ -6776,8 +7091,22 @@
                 <w:color w:val="000000"/>
                 <w:sz w:val="24"/>
               </w:rPr>
-              <w:t>N Núcleo do notebook</w:t>
+              <w:t>N Fórmula no notebook</w:t>
               <w:br/>
+              <w:t>Curvas ou associação elétrica ilustrativa</w:t>
+            </w:r>
+          </w:p>
+          <w:p>
+            <w:pPr>
+              <w:spacing w:after="40" w:before="0" w:line="240" w:lineRule="auto"/>
+              <w:ind w:firstLine="0"/>
+            </w:pPr>
+            <w:r>
+              <w:rPr>
+                <w:rFonts w:ascii="Times New Roman" w:hAnsi="Times New Roman"/>
+                <w:color w:val="000000"/>
+                <w:sz w:val="24"/>
+              </w:rPr>
               <w:t>R08, R10, R13</w:t>
             </w:r>
           </w:p>
@@ -7005,7 +7334,7 @@
                 <w:color w:val="000000"/>
                 <w:sz w:val="24"/>
               </w:rPr>
-              <w:t>ℓj frações de perda; Pa potência bruta; PDC potência líquida.</w:t>
+              <w:t>PDC: potência CC líquida na entrada do inversor [W]; Pa: potência CC bruta do sistema; 2880 módulos [W]; ℓj: fração de perda CC de cabos, mismatch ou conexões [1 (adimensional)]; j: índice da hipótese de perda CC [1 (índice)].</w:t>
             </w:r>
           </w:p>
         </w:tc>
@@ -7025,8 +7354,22 @@
                 <w:color w:val="000000"/>
                 <w:sz w:val="24"/>
               </w:rPr>
-              <w:t>N Núcleo do notebook</w:t>
+              <w:t>N Fórmula no notebook</w:t>
               <w:br/>
+              <w:t>Conversão física principal</w:t>
+            </w:r>
+          </w:p>
+          <w:p>
+            <w:pPr>
+              <w:spacing w:after="40" w:before="0" w:line="240" w:lineRule="auto"/>
+              <w:ind w:firstLine="0"/>
+            </w:pPr>
+            <w:r>
+              <w:rPr>
+                <w:rFonts w:ascii="Times New Roman" w:hAnsi="Times New Roman"/>
+                <w:color w:val="000000"/>
+                <w:sz w:val="24"/>
+              </w:rPr>
               <w:t>R08, R10, R13</w:t>
             </w:r>
           </w:p>
@@ -7124,64 +7467,31 @@
                 </m:rPr>
                 <m:t>min</m:t>
               </m:r>
+              <m:r>
+                <w:rPr>
+                  <w:rFonts w:ascii="Cambria Math" w:hAnsi="Cambria Math"/>
+                  <w:sz w:val="26"/>
+                </w:rPr>
+                <m:rPr>
+                  <m:sty m:val="p"/>
+                </m:rPr>
+                <m:t>[</m:t>
+              </m:r>
+              <m:r>
+                <w:rPr>
+                  <w:rFonts w:ascii="Cambria Math" w:hAnsi="Cambria Math"/>
+                  <w:sz w:val="26"/>
+                </w:rPr>
+                <m:t>η</m:t>
+              </m:r>
               <m:d>
                 <m:dPr>
-                  <m:begChr m:val="["/>
-                  <m:endChr m:val="]"/>
+                  <m:begChr m:val="("/>
+                  <m:endChr m:val=")"/>
                   <m:sepChr m:val=""/>
                   <m:grow/>
                 </m:dPr>
                 <m:e>
-                  <m:r>
-                    <w:rPr>
-                      <w:rFonts w:ascii="Cambria Math" w:hAnsi="Cambria Math"/>
-                      <w:sz w:val="26"/>
-                    </w:rPr>
-                    <m:t>η</m:t>
-                  </m:r>
-                  <m:d>
-                    <m:dPr>
-                      <m:begChr m:val="("/>
-                      <m:endChr m:val=")"/>
-                      <m:sepChr m:val=""/>
-                      <m:grow/>
-                    </m:dPr>
-                    <m:e>
-                      <m:sSub>
-                        <m:e>
-                          <m:r>
-                            <w:rPr>
-                              <w:rFonts w:ascii="Cambria Math" w:hAnsi="Cambria Math"/>
-                              <w:sz w:val="26"/>
-                            </w:rPr>
-                            <m:t>P</m:t>
-                          </m:r>
-                        </m:e>
-                        <m:sub>
-                          <m:r>
-                            <w:rPr>
-                              <w:rFonts w:ascii="Cambria Math" w:hAnsi="Cambria Math"/>
-                              <w:sz w:val="26"/>
-                            </w:rPr>
-                            <m:rPr>
-                              <m:sty m:val="p"/>
-                            </m:rPr>
-                            <m:t>D</m:t>
-                          </m:r>
-                          <m:r>
-                            <w:rPr>
-                              <w:rFonts w:ascii="Cambria Math" w:hAnsi="Cambria Math"/>
-                              <w:sz w:val="26"/>
-                            </w:rPr>
-                            <m:rPr>
-                              <m:sty m:val="p"/>
-                            </m:rPr>
-                            <m:t>C</m:t>
-                          </m:r>
-                        </m:sub>
-                      </m:sSub>
-                    </m:e>
-                  </m:d>
                   <m:sSub>
                     <m:e>
                       <m:r>
@@ -7215,6 +7525,82 @@
                       </m:r>
                     </m:sub>
                   </m:sSub>
+                </m:e>
+              </m:d>
+              <m:sSub>
+                <m:e>
+                  <m:r>
+                    <w:rPr>
+                      <w:rFonts w:ascii="Cambria Math" w:hAnsi="Cambria Math"/>
+                      <w:sz w:val="26"/>
+                    </w:rPr>
+                    <m:t>P</m:t>
+                  </m:r>
+                </m:e>
+                <m:sub>
+                  <m:r>
+                    <w:rPr>
+                      <w:rFonts w:ascii="Cambria Math" w:hAnsi="Cambria Math"/>
+                      <w:sz w:val="26"/>
+                    </w:rPr>
+                    <m:rPr>
+                      <m:sty m:val="p"/>
+                    </m:rPr>
+                    <m:t>D</m:t>
+                  </m:r>
+                  <m:r>
+                    <w:rPr>
+                      <w:rFonts w:ascii="Cambria Math" w:hAnsi="Cambria Math"/>
+                      <w:sz w:val="26"/>
+                    </w:rPr>
+                    <m:rPr>
+                      <m:sty m:val="p"/>
+                    </m:rPr>
+                    <m:t>C</m:t>
+                  </m:r>
+                </m:sub>
+              </m:sSub>
+              <m:r>
+                <w:rPr>
+                  <w:rFonts w:ascii="Cambria Math" w:hAnsi="Cambria Math"/>
+                  <w:sz w:val="26"/>
+                </w:rPr>
+                <m:rPr>
+                  <m:sty m:val="p"/>
+                </m:rPr>
+                <m:t>,</m:t>
+              </m:r>
+              <m:sSub>
+                <m:e>
+                  <m:r>
+                    <w:rPr>
+                      <w:rFonts w:ascii="Cambria Math" w:hAnsi="Cambria Math"/>
+                      <w:sz w:val="26"/>
+                    </w:rPr>
+                    <m:t>P</m:t>
+                  </m:r>
+                </m:e>
+                <m:sub>
+                  <m:r>
+                    <w:rPr>
+                      <w:rFonts w:ascii="Cambria Math" w:hAnsi="Cambria Math"/>
+                      <w:sz w:val="26"/>
+                    </w:rPr>
+                    <m:rPr>
+                      <m:sty m:val="p"/>
+                    </m:rPr>
+                    <m:t>A</m:t>
+                  </m:r>
+                  <m:r>
+                    <w:rPr>
+                      <w:rFonts w:ascii="Cambria Math" w:hAnsi="Cambria Math"/>
+                      <w:sz w:val="26"/>
+                    </w:rPr>
+                    <m:rPr>
+                      <m:sty m:val="p"/>
+                    </m:rPr>
+                    <m:t>C</m:t>
+                  </m:r>
                   <m:r>
                     <w:rPr>
                       <w:rFonts w:ascii="Cambria Math" w:hAnsi="Cambria Math"/>
@@ -7225,81 +7611,48 @@
                     </m:rPr>
                     <m:t>,</m:t>
                   </m:r>
-                  <m:sSub>
-                    <m:e>
-                      <m:r>
-                        <w:rPr>
-                          <w:rFonts w:ascii="Cambria Math" w:hAnsi="Cambria Math"/>
-                          <w:sz w:val="26"/>
-                        </w:rPr>
-                        <m:t>P</m:t>
-                      </m:r>
-                    </m:e>
-                    <m:sub>
-                      <m:r>
-                        <w:rPr>
-                          <w:rFonts w:ascii="Cambria Math" w:hAnsi="Cambria Math"/>
-                          <w:sz w:val="26"/>
-                        </w:rPr>
-                        <m:rPr>
-                          <m:sty m:val="p"/>
-                        </m:rPr>
-                        <m:t>A</m:t>
-                      </m:r>
-                      <m:r>
-                        <w:rPr>
-                          <w:rFonts w:ascii="Cambria Math" w:hAnsi="Cambria Math"/>
-                          <w:sz w:val="26"/>
-                        </w:rPr>
-                        <m:rPr>
-                          <m:sty m:val="p"/>
-                        </m:rPr>
-                        <m:t>C</m:t>
-                      </m:r>
-                      <m:r>
-                        <w:rPr>
-                          <w:rFonts w:ascii="Cambria Math" w:hAnsi="Cambria Math"/>
-                          <w:sz w:val="26"/>
-                        </w:rPr>
-                        <m:rPr>
-                          <m:sty m:val="p"/>
-                        </m:rPr>
-                        <m:t>,</m:t>
-                      </m:r>
-                      <m:r>
-                        <w:rPr>
-                          <w:rFonts w:ascii="Cambria Math" w:hAnsi="Cambria Math"/>
-                          <w:sz w:val="26"/>
-                        </w:rPr>
-                        <m:rPr>
-                          <m:sty m:val="p"/>
-                        </m:rPr>
-                        <m:t>m</m:t>
-                      </m:r>
-                      <m:r>
-                        <w:rPr>
-                          <w:rFonts w:ascii="Cambria Math" w:hAnsi="Cambria Math"/>
-                          <w:sz w:val="26"/>
-                        </w:rPr>
-                        <m:rPr>
-                          <m:sty m:val="p"/>
-                        </m:rPr>
-                        <m:t>a</m:t>
-                      </m:r>
-                      <m:r>
-                        <w:rPr>
-                          <w:rFonts w:ascii="Cambria Math" w:hAnsi="Cambria Math"/>
-                          <w:sz w:val="26"/>
-                        </w:rPr>
-                        <m:rPr>
-                          <m:sty m:val="p"/>
-                        </m:rPr>
-                        <m:t>x</m:t>
-                      </m:r>
-                    </m:sub>
-                  </m:sSub>
-                </m:e>
-              </m:d>
+                  <m:r>
+                    <w:rPr>
+                      <w:rFonts w:ascii="Cambria Math" w:hAnsi="Cambria Math"/>
+                      <w:sz w:val="26"/>
+                    </w:rPr>
+                    <m:rPr>
+                      <m:sty m:val="p"/>
+                    </m:rPr>
+                    <m:t>m</m:t>
+                  </m:r>
+                  <m:r>
+                    <w:rPr>
+                      <w:rFonts w:ascii="Cambria Math" w:hAnsi="Cambria Math"/>
+                      <w:sz w:val="26"/>
+                    </w:rPr>
+                    <m:rPr>
+                      <m:sty m:val="p"/>
+                    </m:rPr>
+                    <m:t>a</m:t>
+                  </m:r>
+                  <m:r>
+                    <w:rPr>
+                      <w:rFonts w:ascii="Cambria Math" w:hAnsi="Cambria Math"/>
+                      <w:sz w:val="26"/>
+                    </w:rPr>
+                    <m:rPr>
+                      <m:sty m:val="p"/>
+                    </m:rPr>
+                    <m:t>x</m:t>
+                  </m:r>
+                </m:sub>
+              </m:sSub>
+              <m:r>
+                <w:rPr>
+                  <w:rFonts w:ascii="Cambria Math" w:hAnsi="Cambria Math"/>
+                  <w:sz w:val="26"/>
+                </w:rPr>
+                <m:rPr>
+                  <m:sty m:val="p"/>
+                </m:rPr>
+                <m:t>]</m:t>
+              </m:r>
             </m:oMath>
           </w:p>
         </w:tc>
@@ -7342,7 +7695,7 @@
                 <w:color w:val="000000"/>
                 <w:sz w:val="24"/>
               </w:rPr>
-              <w:t>η eficiência; PACmax limite; potências em W.</w:t>
+              <w:t>PAC: potência CA após clipping e antes da perda CA [W]; η: eficiência da conversão CC para CA, função de PDC [1 (adimensional)]; PDC: potência CC líquida na entrada do inversor [W]; PAC,max: capacidade CA adotada para o inversor ou sistema [W].</w:t>
             </w:r>
           </w:p>
         </w:tc>
@@ -7362,8 +7715,22 @@
                 <w:color w:val="000000"/>
                 <w:sz w:val="24"/>
               </w:rPr>
-              <w:t>N Núcleo do notebook</w:t>
+              <w:t>N Fórmula no notebook</w:t>
               <w:br/>
+              <w:t>Conversão física principal</w:t>
+            </w:r>
+          </w:p>
+          <w:p>
+            <w:pPr>
+              <w:spacing w:after="40" w:before="0" w:line="240" w:lineRule="auto"/>
+              <w:ind w:firstLine="0"/>
+            </w:pPr>
+            <w:r>
+              <w:rPr>
+                <w:rFonts w:ascii="Times New Roman" w:hAnsi="Times New Roman"/>
+                <w:color w:val="000000"/>
+                <w:sz w:val="24"/>
+              </w:rPr>
               <w:t>R11, R13</w:t>
             </w:r>
           </w:p>
@@ -7669,7 +8036,7 @@
                 <w:color w:val="000000"/>
                 <w:sz w:val="24"/>
               </w:rPr>
-              <w:t>ηnom eficiência nominal; Pdc0 não é a potência STC dos módulos.</w:t>
+              <w:t>Pdc0,inv: potência CC de referência da curva do inversor [W]; PAC,max: capacidade CA adotada para o inversor ou sistema [W]; ηnom: eficiência nominal do inversor; 0,98 [1 (adimensional)].</w:t>
             </w:r>
           </w:p>
         </w:tc>
@@ -7689,8 +8056,22 @@
                 <w:color w:val="000000"/>
                 <w:sz w:val="24"/>
               </w:rPr>
-              <w:t>N Núcleo do notebook</w:t>
+              <w:t>N Fórmula no notebook</w:t>
               <w:br/>
+              <w:t>Conversão física principal</w:t>
+            </w:r>
+          </w:p>
+          <w:p>
+            <w:pPr>
+              <w:spacing w:after="40" w:before="0" w:line="240" w:lineRule="auto"/>
+              <w:ind w:firstLine="0"/>
+            </w:pPr>
+            <w:r>
+              <w:rPr>
+                <w:rFonts w:ascii="Times New Roman" w:hAnsi="Times New Roman"/>
+                <w:color w:val="000000"/>
+                <w:sz w:val="24"/>
+              </w:rPr>
               <w:t>R11, R13</w:t>
             </w:r>
           </w:p>
@@ -7919,7 +8300,7 @@
                 <w:color w:val="000000"/>
                 <w:sz w:val="24"/>
               </w:rPr>
-              <w:t>ζ adimensional; mesma unidade nas duas potências.</w:t>
+              <w:t>ζ: carregamento relativo CC do inversor [1 (adimensional)]; PDC: potência CC líquida na entrada do inversor [W]; Pdc0,inv: potência CC de referência da curva do inversor [W].</w:t>
             </w:r>
           </w:p>
         </w:tc>
@@ -7939,8 +8320,22 @@
                 <w:color w:val="000000"/>
                 <w:sz w:val="24"/>
               </w:rPr>
-              <w:t>C Apoio do código</w:t>
+              <w:t>C Relação do código</w:t>
               <w:br/>
+              <w:t>Conversão física principal</w:t>
+            </w:r>
+          </w:p>
+          <w:p>
+            <w:pPr>
+              <w:spacing w:after="40" w:before="0" w:line="240" w:lineRule="auto"/>
+              <w:ind w:firstLine="0"/>
+            </w:pPr>
+            <w:r>
+              <w:rPr>
+                <w:rFonts w:ascii="Times New Roman" w:hAnsi="Times New Roman"/>
+                <w:color w:val="000000"/>
+                <w:sz w:val="24"/>
+              </w:rPr>
               <w:t>R11, R13</w:t>
             </w:r>
           </w:p>
@@ -8223,7 +8618,7 @@
                 <w:color w:val="000000"/>
                 <w:sz w:val="24"/>
               </w:rPr>
-              <w:t>ζ positivo; ηnom igual a 0,98; ηref igual a 0,9637.</w:t>
+              <w:t>η: eficiência da conversão CC para CA, função de PDC [1 (adimensional)]; ηnom: eficiência nominal do inversor; 0,98 [1 (adimensional)]; ηref: eficiência de referência da curva do inversor; 0,9637 [1 (adimensional)]; ζ: carregamento relativo CC do inversor [1 (adimensional)].</w:t>
             </w:r>
           </w:p>
         </w:tc>
@@ -8243,8 +8638,22 @@
                 <w:color w:val="000000"/>
                 <w:sz w:val="24"/>
               </w:rPr>
-              <w:t>C Apoio do código</w:t>
+              <w:t>C Relação do código</w:t>
               <w:br/>
+              <w:t>Conversão física principal</w:t>
+            </w:r>
+          </w:p>
+          <w:p>
+            <w:pPr>
+              <w:spacing w:after="40" w:before="0" w:line="240" w:lineRule="auto"/>
+              <w:ind w:firstLine="0"/>
+            </w:pPr>
+            <w:r>
+              <w:rPr>
+                <w:rFonts w:ascii="Times New Roman" w:hAnsi="Times New Roman"/>
+                <w:color w:val="000000"/>
+                <w:sz w:val="24"/>
+              </w:rPr>
               <w:t>R11, R13</w:t>
             </w:r>
           </w:p>
@@ -8461,7 +8870,7 @@
                 <w:color w:val="000000"/>
                 <w:sz w:val="24"/>
               </w:rPr>
-              <w:t>Ppre em W; PDC igual a zero produz Ppre igual a zero.</w:t>
+              <w:t>Ppre: potência CA após piso zero e antes do clipping [W]; η: eficiência da conversão CC para CA, função de PDC [1 (adimensional)]; PDC: potência CC líquida na entrada do inversor [W].</w:t>
             </w:r>
           </w:p>
         </w:tc>
@@ -8481,8 +8890,22 @@
                 <w:color w:val="000000"/>
                 <w:sz w:val="24"/>
               </w:rPr>
-              <w:t>C Apoio do código</w:t>
+              <w:t>C Relação do código</w:t>
               <w:br/>
+              <w:t>Conversão física principal</w:t>
+            </w:r>
+          </w:p>
+          <w:p>
+            <w:pPr>
+              <w:spacing w:after="40" w:before="0" w:line="240" w:lineRule="auto"/>
+              <w:ind w:firstLine="0"/>
+            </w:pPr>
+            <w:r>
+              <w:rPr>
+                <w:rFonts w:ascii="Times New Roman" w:hAnsi="Times New Roman"/>
+                <w:color w:val="000000"/>
+                <w:sz w:val="24"/>
+              </w:rPr>
               <w:t>R11, R13</w:t>
             </w:r>
           </w:p>
@@ -8718,7 +9141,7 @@
                 <w:color w:val="000000"/>
                 <w:sz w:val="24"/>
               </w:rPr>
-              <w:t>Pclip em W; não confundir com energia perdida.</w:t>
+              <w:t>Pclip: potência suprimida pelo clipping [W]; Ppre: potência CA após piso zero e antes do clipping [W]; PAC: potência CA após clipping e antes da perda CA [W].</w:t>
             </w:r>
           </w:p>
         </w:tc>
@@ -8738,8 +9161,22 @@
                 <w:color w:val="000000"/>
                 <w:sz w:val="24"/>
               </w:rPr>
-              <w:t>C Apoio do código</w:t>
+              <w:t>C Relação do código</w:t>
               <w:br/>
+              <w:t>Conversão física principal</w:t>
+            </w:r>
+          </w:p>
+          <w:p>
+            <w:pPr>
+              <w:spacing w:after="40" w:before="0" w:line="240" w:lineRule="auto"/>
+              <w:ind w:firstLine="0"/>
+            </w:pPr>
+            <w:r>
+              <w:rPr>
+                <w:rFonts w:ascii="Times New Roman" w:hAnsi="Times New Roman"/>
+                <w:color w:val="000000"/>
+                <w:sz w:val="24"/>
+              </w:rPr>
               <w:t>R11, R13</w:t>
             </w:r>
           </w:p>
@@ -9025,7 +9462,7 @@
                 <w:color w:val="000000"/>
                 <w:sz w:val="24"/>
               </w:rPr>
-              <w:t>ℓAC fração de perda; PACfinal em W.</w:t>
+              <w:t>PAC,final: potência CA após todas as perdas assumidas [W]; ℓAC: fração de perda CA após o inversor [1 (adimensional)]; PAC: potência CA após clipping e antes da perda CA [W].</w:t>
             </w:r>
           </w:p>
         </w:tc>
@@ -9045,8 +9482,22 @@
                 <w:color w:val="000000"/>
                 <w:sz w:val="24"/>
               </w:rPr>
-              <w:t>C Apoio do código</w:t>
+              <w:t>C Relação do código</w:t>
               <w:br/>
+              <w:t>Conversão física principal</w:t>
+            </w:r>
+          </w:p>
+          <w:p>
+            <w:pPr>
+              <w:spacing w:after="40" w:before="0" w:line="240" w:lineRule="auto"/>
+              <w:ind w:firstLine="0"/>
+            </w:pPr>
+            <w:r>
+              <w:rPr>
+                <w:rFonts w:ascii="Times New Roman" w:hAnsi="Times New Roman"/>
+                <w:color w:val="000000"/>
+                <w:sz w:val="24"/>
+              </w:rPr>
               <w:t>R11, R13</w:t>
             </w:r>
           </w:p>
@@ -9225,7 +9676,7 @@
                 <w:color w:val="000000"/>
                 <w:sz w:val="24"/>
               </w:rPr>
-              <w:t>P em kW; Δt igual a 0,25 h; E em kWh. Se P estiver em W dividir por 1000.</w:t>
+              <w:t>E: energia elétrica acumulada na janela [kWh]; Pi: potência média no intervalo i; converter W para kW [kW]; Δti: duração do intervalo i; 0,25 h na série local [h]; i: índice do intervalo ou da observação na janela [1 (índice)].</w:t>
             </w:r>
           </w:p>
         </w:tc>
@@ -9245,8 +9696,22 @@
                 <w:color w:val="000000"/>
                 <w:sz w:val="24"/>
               </w:rPr>
-              <w:t>N Núcleo do notebook</w:t>
+              <w:t>N Fórmula no notebook</w:t>
               <w:br/>
+              <w:t>Integração ou estatística dos dados</w:t>
+            </w:r>
+          </w:p>
+          <w:p>
+            <w:pPr>
+              <w:spacing w:after="40" w:before="0" w:line="240" w:lineRule="auto"/>
+              <w:ind w:firstLine="0"/>
+            </w:pPr>
+            <w:r>
+              <w:rPr>
+                <w:rFonts w:ascii="Times New Roman" w:hAnsi="Times New Roman"/>
+                <w:color w:val="000000"/>
+                <w:sz w:val="24"/>
+              </w:rPr>
               <w:t>R12</w:t>
             </w:r>
           </w:p>
@@ -9268,6 +9733,9 @@
       </w:r>
     </w:p>
     <w:p>
+      <w:pPr>
+        <w:keepNext/>
+      </w:pPr>
       <w:r>
         <w:t>Distribuição por subseção: 4.1 com 3 relações; 4.2 com 3 relações; 4.3 com 3 relações; 4.4 com 10 relações; 4.5 com 11 relações.</w:t>
       </w:r>
@@ -9312,6 +9780,7 @@
           </w:tcPr>
           <w:p>
             <w:pPr>
+              <w:keepNext/>
               <w:spacing w:after="40" w:before="0" w:line="240" w:lineRule="auto"/>
               <w:ind w:firstLine="0"/>
             </w:pPr>
@@ -9334,6 +9803,7 @@
           </w:tcPr>
           <w:p>
             <w:pPr>
+              <w:keepNext/>
               <w:spacing w:after="40" w:before="0" w:line="240" w:lineRule="auto"/>
               <w:ind w:firstLine="0"/>
             </w:pPr>
@@ -9356,6 +9826,7 @@
           </w:tcPr>
           <w:p>
             <w:pPr>
+              <w:keepNext/>
               <w:spacing w:after="40" w:before="0" w:line="240" w:lineRule="auto"/>
               <w:ind w:firstLine="0"/>
             </w:pPr>
@@ -9366,7 +9837,7 @@
                 <w:color w:val="000000"/>
                 <w:sz w:val="24"/>
               </w:rPr>
-              <w:t>Função e símbolos</w:t>
+              <w:t>Função e símbolos com unidades</w:t>
             </w:r>
           </w:p>
         </w:tc>
@@ -9378,6 +9849,7 @@
           </w:tcPr>
           <w:p>
             <w:pPr>
+              <w:keepNext/>
               <w:spacing w:after="40" w:before="0" w:line="240" w:lineRule="auto"/>
               <w:ind w:firstLine="0"/>
             </w:pPr>
@@ -9388,7 +9860,7 @@
                 <w:color w:val="000000"/>
                 <w:sz w:val="24"/>
               </w:rPr>
-              <w:t>Origem e uso</w:t>
+              <w:t>Registro e aplicação</w:t>
             </w:r>
           </w:p>
         </w:tc>
@@ -9578,7 +10050,7 @@
                 <w:color w:val="000000"/>
                 <w:sz w:val="24"/>
               </w:rPr>
-              <w:t>Ej energias na mesma máscara temporal em kWh.</w:t>
+              <w:t>ΔEj: variação de energia entre estágios consecutivos [kWh]; Ej: energia do estágio j na máscara pareada [kWh]; Ej+1: energia do estágio seguinte na mesma máscara [kWh]; j: índice do estágio da cadeia de energia [1 (índice)].</w:t>
             </w:r>
           </w:p>
         </w:tc>
@@ -9598,8 +10070,22 @@
                 <w:color w:val="000000"/>
                 <w:sz w:val="24"/>
               </w:rPr>
-              <w:t>N Núcleo do notebook</w:t>
+              <w:t>N Fórmula no notebook</w:t>
               <w:br/>
+              <w:t>Indicadores e avaliação do modelo</w:t>
+            </w:r>
+          </w:p>
+          <w:p>
+            <w:pPr>
+              <w:spacing w:after="40" w:before="0" w:line="240" w:lineRule="auto"/>
+              <w:ind w:firstLine="0"/>
+            </w:pPr>
+            <w:r>
+              <w:rPr>
+                <w:rFonts w:ascii="Times New Roman" w:hAnsi="Times New Roman"/>
+                <w:color w:val="000000"/>
+                <w:sz w:val="24"/>
+              </w:rPr>
               <w:t>R08, R11, R12, R25</w:t>
             </w:r>
           </w:p>
@@ -9844,7 +10330,7 @@
                 <w:color w:val="000000"/>
                 <w:sz w:val="24"/>
               </w:rPr>
-              <w:t>Mesmos estágios e intervalos; podem ocorrer ganhos sob frio.</w:t>
+              <w:t>ΔEj: variação de energia entre estágios consecutivos [kWh]; E1: energia do primeiro estágio; referência linear STC [kWh]; Efinal: energia CA final do último estágio [kWh]; j: índice do estágio da cadeia de energia [1 (índice)].</w:t>
             </w:r>
           </w:p>
         </w:tc>
@@ -9864,8 +10350,22 @@
                 <w:color w:val="000000"/>
                 <w:sz w:val="24"/>
               </w:rPr>
-              <w:t>N Núcleo do notebook</w:t>
+              <w:t>N Fórmula no notebook</w:t>
               <w:br/>
+              <w:t>Indicadores e avaliação do modelo</w:t>
+            </w:r>
+          </w:p>
+          <w:p>
+            <w:pPr>
+              <w:spacing w:after="40" w:before="0" w:line="240" w:lineRule="auto"/>
+              <w:ind w:firstLine="0"/>
+            </w:pPr>
+            <w:r>
+              <w:rPr>
+                <w:rFonts w:ascii="Times New Roman" w:hAnsi="Times New Roman"/>
+                <w:color w:val="000000"/>
+                <w:sz w:val="24"/>
+              </w:rPr>
               <w:t>R08, R11, R12, R25</w:t>
             </w:r>
           </w:p>
@@ -10120,7 +10620,7 @@
                 <w:color w:val="000000"/>
                 <w:sz w:val="24"/>
               </w:rPr>
-              <w:t>P0 capacidade declarada; Gref igual a 1000 W/m²; potências na mesma unidade.</w:t>
+              <w:t>Plin: potência linear de referência STC do sistema [W]; P0: capacidade declarada; 893000 W na expressão de potência [W]; GPOA: irradiância no plano; medida no modelo principal [W/m²]; Gref: irradiância STC de referência; 1000 [W/m²].</w:t>
             </w:r>
           </w:p>
         </w:tc>
@@ -10140,8 +10640,22 @@
                 <w:color w:val="000000"/>
                 <w:sz w:val="24"/>
               </w:rPr>
-              <w:t>C Apoio do código</w:t>
+              <w:t>C Relação do código</w:t>
               <w:br/>
+              <w:t>Indicadores e avaliação do modelo</w:t>
+            </w:r>
+          </w:p>
+          <w:p>
+            <w:pPr>
+              <w:spacing w:after="40" w:before="0" w:line="240" w:lineRule="auto"/>
+              <w:ind w:firstLine="0"/>
+            </w:pPr>
+            <w:r>
+              <w:rPr>
+                <w:rFonts w:ascii="Times New Roman" w:hAnsi="Times New Roman"/>
+                <w:color w:val="000000"/>
+                <w:sz w:val="24"/>
+              </w:rPr>
               <w:t>R08, R11, R12, R25</w:t>
             </w:r>
           </w:p>
@@ -10354,7 +10868,7 @@
                 <w:color w:val="000000"/>
                 <w:sz w:val="24"/>
               </w:rPr>
-              <w:t>HPOA em kWh/m²; Gref igual a 1 kW/m²; Yr em h.</w:t>
+              <w:t>Yr: produtividade de referência ou HSP da janela [h]; HPOA: irradiação POA integrada na mesma janela [kWh/m²]; Gref: irradiância STC de referência; 1 [kW/m²].</w:t>
             </w:r>
           </w:p>
         </w:tc>
@@ -10374,8 +10888,22 @@
                 <w:color w:val="000000"/>
                 <w:sz w:val="24"/>
               </w:rPr>
-              <w:t>N Núcleo do notebook</w:t>
+              <w:t>N Fórmula no notebook</w:t>
               <w:br/>
+              <w:t>Indicadores e avaliação do modelo</w:t>
+            </w:r>
+          </w:p>
+          <w:p>
+            <w:pPr>
+              <w:spacing w:after="40" w:before="0" w:line="240" w:lineRule="auto"/>
+              <w:ind w:firstLine="0"/>
+            </w:pPr>
+            <w:r>
+              <w:rPr>
+                <w:rFonts w:ascii="Times New Roman" w:hAnsi="Times New Roman"/>
+                <w:color w:val="000000"/>
+                <w:sz w:val="24"/>
+              </w:rPr>
               <w:t>R12, R30</w:t>
             </w:r>
           </w:p>
@@ -10555,7 +11083,7 @@
                 <w:color w:val="000000"/>
                 <w:sz w:val="24"/>
               </w:rPr>
-              <w:t>EDC em kWh; P0 em kWp; Ya em kWh/kWp ou horas equivalentes.</w:t>
+              <w:t>Ya: produtividade CC modelada do arranjo [kWh/kWp (h equivalentes)]; EDC: energia CC líquida modelada na janela [kWh]; P0: capacidade nominal declarada do sistema; 893 [kWp].</w:t>
             </w:r>
           </w:p>
         </w:tc>
@@ -10575,8 +11103,22 @@
                 <w:color w:val="000000"/>
                 <w:sz w:val="24"/>
               </w:rPr>
-              <w:t>N Núcleo do notebook</w:t>
+              <w:t>N Fórmula no notebook</w:t>
               <w:br/>
+              <w:t>Indicadores e avaliação do modelo</w:t>
+            </w:r>
+          </w:p>
+          <w:p>
+            <w:pPr>
+              <w:spacing w:after="40" w:before="0" w:line="240" w:lineRule="auto"/>
+              <w:ind w:firstLine="0"/>
+            </w:pPr>
+            <w:r>
+              <w:rPr>
+                <w:rFonts w:ascii="Times New Roman" w:hAnsi="Times New Roman"/>
+                <w:color w:val="000000"/>
+                <w:sz w:val="24"/>
+              </w:rPr>
               <w:t>R12, R30</w:t>
             </w:r>
           </w:p>
@@ -10756,7 +11298,7 @@
                 <w:color w:val="000000"/>
                 <w:sz w:val="24"/>
               </w:rPr>
-              <w:t>EAC em kWh; P0 em kWp; Yf em kWh/kWp.</w:t>
+              <w:t>Yf: produtividade CA observada ou modelada, identificada [kWh/kWp (h equivalentes)]; EAC: energia CA observada ou modelada, identificada [kWh]; P0: capacidade nominal declarada do sistema; 893 [kWp].</w:t>
             </w:r>
           </w:p>
         </w:tc>
@@ -10776,8 +11318,22 @@
                 <w:color w:val="000000"/>
                 <w:sz w:val="24"/>
               </w:rPr>
-              <w:t>N Núcleo do notebook</w:t>
+              <w:t>N Fórmula no notebook</w:t>
               <w:br/>
+              <w:t>Indicadores e avaliação do modelo</w:t>
+            </w:r>
+          </w:p>
+          <w:p>
+            <w:pPr>
+              <w:spacing w:after="40" w:before="0" w:line="240" w:lineRule="auto"/>
+              <w:ind w:firstLine="0"/>
+            </w:pPr>
+            <w:r>
+              <w:rPr>
+                <w:rFonts w:ascii="Times New Roman" w:hAnsi="Times New Roman"/>
+                <w:color w:val="000000"/>
+                <w:sz w:val="24"/>
+              </w:rPr>
               <w:t>R12, R30</w:t>
             </w:r>
           </w:p>
@@ -10938,7 +11494,7 @@
                 <w:color w:val="000000"/>
                 <w:sz w:val="24"/>
               </w:rPr>
-              <w:t>PR adimensional; multiplicar por 100 quando apresentado em %.</w:t>
+              <w:t>PR: razão de desempenho na mesma janela [1 (adimensional)]; Yf: produtividade CA observada ou modelada, identificada [kWh/kWp (h equivalentes)]; Yr: produtividade de referência ou HSP da janela [h].</w:t>
             </w:r>
           </w:p>
         </w:tc>
@@ -10958,8 +11514,22 @@
                 <w:color w:val="000000"/>
                 <w:sz w:val="24"/>
               </w:rPr>
-              <w:t>N Núcleo do notebook</w:t>
+              <w:t>N Fórmula no notebook</w:t>
               <w:br/>
+              <w:t>Indicadores e avaliação do modelo</w:t>
+            </w:r>
+          </w:p>
+          <w:p>
+            <w:pPr>
+              <w:spacing w:after="40" w:before="0" w:line="240" w:lineRule="auto"/>
+              <w:ind w:firstLine="0"/>
+            </w:pPr>
+            <w:r>
+              <w:rPr>
+                <w:rFonts w:ascii="Times New Roman" w:hAnsi="Times New Roman"/>
+                <w:color w:val="000000"/>
+                <w:sz w:val="24"/>
+              </w:rPr>
               <w:t>R12, R30</w:t>
             </w:r>
           </w:p>
@@ -11126,7 +11696,7 @@
                 <w:color w:val="000000"/>
                 <w:sz w:val="24"/>
               </w:rPr>
-              <w:t>Lc em horas equivalentes.</w:t>
+              <w:t>Lc: perda de captura normalizada do modelo [h equivalentes]; Yr: produtividade de referência ou HSP da janela [h]; Ya: produtividade CC modelada do arranjo [kWh/kWp (h equivalentes)].</w:t>
             </w:r>
           </w:p>
         </w:tc>
@@ -11146,8 +11716,22 @@
                 <w:color w:val="000000"/>
                 <w:sz w:val="24"/>
               </w:rPr>
-              <w:t>N Núcleo do notebook</w:t>
+              <w:t>N Fórmula no notebook</w:t>
               <w:br/>
+              <w:t>Indicadores e avaliação do modelo</w:t>
+            </w:r>
+          </w:p>
+          <w:p>
+            <w:pPr>
+              <w:spacing w:after="40" w:before="0" w:line="240" w:lineRule="auto"/>
+              <w:ind w:firstLine="0"/>
+            </w:pPr>
+            <w:r>
+              <w:rPr>
+                <w:rFonts w:ascii="Times New Roman" w:hAnsi="Times New Roman"/>
+                <w:color w:val="000000"/>
+                <w:sz w:val="24"/>
+              </w:rPr>
               <w:t>R12, R30</w:t>
             </w:r>
           </w:p>
@@ -11314,7 +11898,7 @@
                 <w:color w:val="000000"/>
                 <w:sz w:val="24"/>
               </w:rPr>
-              <w:t>Ls em horas equivalentes.</w:t>
+              <w:t>Ls: perda de sistema normalizada do modelo [h equivalentes]; Ya: produtividade CC modelada do arranjo [kWh/kWp (h equivalentes)]; Yf: produtividade CA observada ou modelada, identificada [kWh/kWp (h equivalentes)].</w:t>
             </w:r>
           </w:p>
         </w:tc>
@@ -11334,8 +11918,22 @@
                 <w:color w:val="000000"/>
                 <w:sz w:val="24"/>
               </w:rPr>
-              <w:t>N Núcleo do notebook</w:t>
+              <w:t>N Fórmula no notebook</w:t>
               <w:br/>
+              <w:t>Indicadores e avaliação do modelo</w:t>
+            </w:r>
+          </w:p>
+          <w:p>
+            <w:pPr>
+              <w:spacing w:after="40" w:before="0" w:line="240" w:lineRule="auto"/>
+              <w:ind w:firstLine="0"/>
+            </w:pPr>
+            <w:r>
+              <w:rPr>
+                <w:rFonts w:ascii="Times New Roman" w:hAnsi="Times New Roman"/>
+                <w:color w:val="000000"/>
+                <w:sz w:val="24"/>
+              </w:rPr>
               <w:t>R12, R30</w:t>
             </w:r>
           </w:p>
@@ -11502,7 +12100,7 @@
                 <w:color w:val="000000"/>
                 <w:sz w:val="24"/>
               </w:rPr>
-              <w:t>pi potência simulada; yi observada; ambas em kW.</w:t>
+              <w:t>ei: resíduo simulado menos observado no intervalo [kW]; pi: potência CA final simulada no intervalo [kW]; yi: potência CA observada no medidor no intervalo [kW]; i: índice do intervalo ou da observação na janela [1 (índice)].</w:t>
             </w:r>
           </w:p>
         </w:tc>
@@ -11522,8 +12120,22 @@
                 <w:color w:val="000000"/>
                 <w:sz w:val="24"/>
               </w:rPr>
-              <w:t>C Apoio do código</w:t>
+              <w:t>C Relação do código</w:t>
               <w:br/>
+              <w:t>Indicadores e avaliação do modelo</w:t>
+            </w:r>
+          </w:p>
+          <w:p>
+            <w:pPr>
+              <w:spacing w:after="40" w:before="0" w:line="240" w:lineRule="auto"/>
+              <w:ind w:firstLine="0"/>
+            </w:pPr>
+            <w:r>
+              <w:rPr>
+                <w:rFonts w:ascii="Times New Roman" w:hAnsi="Times New Roman"/>
+                <w:color w:val="000000"/>
+                <w:sz w:val="24"/>
+              </w:rPr>
               <w:t>R27, R25</w:t>
             </w:r>
           </w:p>
@@ -11729,7 +12341,7 @@
                 <w:color w:val="000000"/>
                 <w:sz w:val="24"/>
               </w:rPr>
-              <w:t>n pares válidos; MBE em kW.</w:t>
+              <w:t>MBE: erro médio de viés [kW]; n: número de pares válidos usados na métrica [1 (contagem)]; ei: resíduo simulado menos observado no intervalo [kW]; i: índice do intervalo ou da observação na janela [1 (índice)].</w:t>
             </w:r>
           </w:p>
         </w:tc>
@@ -11749,8 +12361,22 @@
                 <w:color w:val="000000"/>
                 <w:sz w:val="24"/>
               </w:rPr>
-              <w:t>N Núcleo do notebook</w:t>
+              <w:t>N Fórmula no notebook</w:t>
               <w:br/>
+              <w:t>Indicadores e avaliação do modelo</w:t>
+            </w:r>
+          </w:p>
+          <w:p>
+            <w:pPr>
+              <w:spacing w:after="40" w:before="0" w:line="240" w:lineRule="auto"/>
+              <w:ind w:firstLine="0"/>
+            </w:pPr>
+            <w:r>
+              <w:rPr>
+                <w:rFonts w:ascii="Times New Roman" w:hAnsi="Times New Roman"/>
+                <w:color w:val="000000"/>
+                <w:sz w:val="24"/>
+              </w:rPr>
               <w:t>R27, R25</w:t>
             </w:r>
           </w:p>
@@ -11892,36 +12518,46 @@
                   </m:r>
                 </m:sup>
                 <m:e>
-                  <m:d>
-                    <m:dPr>
-                      <m:begChr m:val="|"/>
-                      <m:endChr m:val="|"/>
-                      <m:sepChr m:val=""/>
-                      <m:grow/>
-                    </m:dPr>
+                  <m:r>
+                    <w:rPr>
+                      <w:rFonts w:ascii="Cambria Math" w:hAnsi="Cambria Math"/>
+                      <w:sz w:val="26"/>
+                    </w:rPr>
+                    <m:rPr>
+                      <m:sty m:val="p"/>
+                    </m:rPr>
+                    <m:t>|</m:t>
+                  </m:r>
+                  <m:sSub>
                     <m:e>
-                      <m:sSub>
-                        <m:e>
-                          <m:r>
-                            <w:rPr>
-                              <w:rFonts w:ascii="Cambria Math" w:hAnsi="Cambria Math"/>
-                              <w:sz w:val="26"/>
-                            </w:rPr>
-                            <m:t>e</m:t>
-                          </m:r>
-                        </m:e>
-                        <m:sub>
-                          <m:r>
-                            <w:rPr>
-                              <w:rFonts w:ascii="Cambria Math" w:hAnsi="Cambria Math"/>
-                              <w:sz w:val="26"/>
-                            </w:rPr>
-                            <m:t>i</m:t>
-                          </m:r>
-                        </m:sub>
-                      </m:sSub>
+                      <m:r>
+                        <w:rPr>
+                          <w:rFonts w:ascii="Cambria Math" w:hAnsi="Cambria Math"/>
+                          <w:sz w:val="26"/>
+                        </w:rPr>
+                        <m:t>e</m:t>
+                      </m:r>
                     </m:e>
-                  </m:d>
+                    <m:sub>
+                      <m:r>
+                        <w:rPr>
+                          <w:rFonts w:ascii="Cambria Math" w:hAnsi="Cambria Math"/>
+                          <w:sz w:val="26"/>
+                        </w:rPr>
+                        <m:t>i</m:t>
+                      </m:r>
+                    </m:sub>
+                  </m:sSub>
+                  <m:r>
+                    <w:rPr>
+                      <w:rFonts w:ascii="Cambria Math" w:hAnsi="Cambria Math"/>
+                      <w:sz w:val="26"/>
+                    </w:rPr>
+                    <m:rPr>
+                      <m:sty m:val="p"/>
+                    </m:rPr>
+                    <m:t>|</m:t>
+                  </m:r>
                 </m:e>
               </m:nary>
             </m:oMath>
@@ -11966,7 +12602,7 @@
                 <w:color w:val="000000"/>
                 <w:sz w:val="24"/>
               </w:rPr>
-              <w:t>MAE em kW.</w:t>
+              <w:t>MAE: erro absoluto médio [kW]; n: número de pares válidos usados na métrica [1 (contagem)]; ei: resíduo simulado menos observado no intervalo [kW]; i: índice do intervalo ou da observação na janela [1 (índice)].</w:t>
             </w:r>
           </w:p>
         </w:tc>
@@ -11986,8 +12622,22 @@
                 <w:color w:val="000000"/>
                 <w:sz w:val="24"/>
               </w:rPr>
-              <w:t>N Núcleo do notebook</w:t>
+              <w:t>N Fórmula no notebook</w:t>
               <w:br/>
+              <w:t>Indicadores e avaliação do modelo</w:t>
+            </w:r>
+          </w:p>
+          <w:p>
+            <w:pPr>
+              <w:spacing w:after="40" w:before="0" w:line="240" w:lineRule="auto"/>
+              <w:ind w:firstLine="0"/>
+            </w:pPr>
+            <w:r>
+              <w:rPr>
+                <w:rFonts w:ascii="Times New Roman" w:hAnsi="Times New Roman"/>
+                <w:color w:val="000000"/>
+                <w:sz w:val="24"/>
+              </w:rPr>
               <w:t>R27, R25</w:t>
             </w:r>
           </w:p>
@@ -12217,7 +12867,7 @@
                 <w:color w:val="000000"/>
                 <w:sz w:val="24"/>
               </w:rPr>
-              <w:t>RMSE em kW.</w:t>
+              <w:t>RMSE: raiz do erro quadrático médio [kW]; n: número de pares válidos usados na métrica [1 (contagem)]; ei: resíduo simulado menos observado no intervalo [kW]; i: índice do intervalo ou da observação na janela [1 (índice)].</w:t>
             </w:r>
           </w:p>
         </w:tc>
@@ -12237,8 +12887,22 @@
                 <w:color w:val="000000"/>
                 <w:sz w:val="24"/>
               </w:rPr>
-              <w:t>N Núcleo do notebook</w:t>
+              <w:t>N Fórmula no notebook</w:t>
               <w:br/>
+              <w:t>Indicadores e avaliação do modelo</w:t>
+            </w:r>
+          </w:p>
+          <w:p>
+            <w:pPr>
+              <w:spacing w:after="40" w:before="0" w:line="240" w:lineRule="auto"/>
+              <w:ind w:firstLine="0"/>
+            </w:pPr>
+            <w:r>
+              <w:rPr>
+                <w:rFonts w:ascii="Times New Roman" w:hAnsi="Times New Roman"/>
+                <w:color w:val="000000"/>
+                <w:sz w:val="24"/>
+              </w:rPr>
               <w:t>R27, R25</w:t>
             </w:r>
           </w:p>
@@ -12414,7 +13078,7 @@
                 <w:color w:val="000000"/>
                 <w:sz w:val="24"/>
               </w:rPr>
-              <w:t>nMBE em %; média observada não nula.</w:t>
+              <w:t>nMBE: viés normalizado pela média observada [%]; MBE: erro médio de viés [kW]; ȳ: média das potências CA observadas pareadas [kW].</w:t>
             </w:r>
           </w:p>
         </w:tc>
@@ -12434,8 +13098,22 @@
                 <w:color w:val="000000"/>
                 <w:sz w:val="24"/>
               </w:rPr>
-              <w:t>C Apoio do código</w:t>
+              <w:t>C Relação do código</w:t>
               <w:br/>
+              <w:t>Indicadores e avaliação do modelo</w:t>
+            </w:r>
+          </w:p>
+          <w:p>
+            <w:pPr>
+              <w:spacing w:after="40" w:before="0" w:line="240" w:lineRule="auto"/>
+              <w:ind w:firstLine="0"/>
+            </w:pPr>
+            <w:r>
+              <w:rPr>
+                <w:rFonts w:ascii="Times New Roman" w:hAnsi="Times New Roman"/>
+                <w:color w:val="000000"/>
+                <w:sz w:val="24"/>
+              </w:rPr>
               <w:t>R27, R25</w:t>
             </w:r>
           </w:p>
@@ -12625,7 +13303,7 @@
                 <w:color w:val="000000"/>
                 <w:sz w:val="24"/>
               </w:rPr>
-              <w:t>nRMSE em %; não usar potência nominal como denominador neste projeto.</w:t>
+              <w:t>nRMSE: RMSE normalizado pela média observada [%]; RMSE: raiz do erro quadrático médio [kW]; ȳ: média das potências CA observadas pareadas [kW].</w:t>
             </w:r>
           </w:p>
         </w:tc>
@@ -12645,8 +13323,22 @@
                 <w:color w:val="000000"/>
                 <w:sz w:val="24"/>
               </w:rPr>
-              <w:t>C Apoio do código</w:t>
+              <w:t>C Relação do código</w:t>
               <w:br/>
+              <w:t>Indicadores e avaliação do modelo</w:t>
+            </w:r>
+          </w:p>
+          <w:p>
+            <w:pPr>
+              <w:spacing w:after="40" w:before="0" w:line="240" w:lineRule="auto"/>
+              <w:ind w:firstLine="0"/>
+            </w:pPr>
+            <w:r>
+              <w:rPr>
+                <w:rFonts w:ascii="Times New Roman" w:hAnsi="Times New Roman"/>
+                <w:color w:val="000000"/>
+                <w:sz w:val="24"/>
+              </w:rPr>
               <w:t>R27, R25</w:t>
             </w:r>
           </w:p>
@@ -13093,7 +13785,7 @@
                 <w:color w:val="000000"/>
                 <w:sz w:val="24"/>
               </w:rPr>
-              <w:t>r adimensional; requer variância positiva nas duas séries.</w:t>
+              <w:t>r: coeficiente de correlação de Pearson [1 (adimensional)]; yi: potência CA observada no medidor no intervalo [kW]; ȳ: média das potências CA observadas pareadas [kW]; pi: potência CA final simulada no intervalo [kW]; p̄: média das potências CA simuladas pareadas [kW]; i: índice do intervalo ou da observação na janela [1 (índice)].</w:t>
             </w:r>
           </w:p>
         </w:tc>
@@ -13113,8 +13805,22 @@
                 <w:color w:val="000000"/>
                 <w:sz w:val="24"/>
               </w:rPr>
-              <w:t>C Apoio do código</w:t>
+              <w:t>C Relação do código</w:t>
               <w:br/>
+              <w:t>Indicadores e avaliação do modelo</w:t>
+            </w:r>
+          </w:p>
+          <w:p>
+            <w:pPr>
+              <w:spacing w:after="40" w:before="0" w:line="240" w:lineRule="auto"/>
+              <w:ind w:firstLine="0"/>
+            </w:pPr>
+            <w:r>
+              <w:rPr>
+                <w:rFonts w:ascii="Times New Roman" w:hAnsi="Times New Roman"/>
+                <w:color w:val="000000"/>
+                <w:sz w:val="24"/>
+              </w:rPr>
               <w:t>R27, R25</w:t>
             </w:r>
           </w:p>
@@ -13373,7 +14079,7 @@
                 <w:color w:val="000000"/>
                 <w:sz w:val="24"/>
               </w:rPr>
-              <w:t>R² adimensional; denominador positivo.</w:t>
+              <w:t>R²: coeficiente de determinação definido por 1−SSE/SST [1 (adimensional)]; ei: resíduo simulado menos observado no intervalo [kW]; yi: potência CA observada no medidor no intervalo [kW]; ȳ: média das potências CA observadas pareadas [kW]; i: índice do intervalo ou da observação na janela [1 (índice)].</w:t>
             </w:r>
           </w:p>
         </w:tc>
@@ -13393,8 +14099,22 @@
                 <w:color w:val="000000"/>
                 <w:sz w:val="24"/>
               </w:rPr>
-              <w:t>N Núcleo do notebook</w:t>
+              <w:t>N Fórmula no notebook</w:t>
               <w:br/>
+              <w:t>Indicadores e avaliação do modelo</w:t>
+            </w:r>
+          </w:p>
+          <w:p>
+            <w:pPr>
+              <w:spacing w:after="40" w:before="0" w:line="240" w:lineRule="auto"/>
+              <w:ind w:firstLine="0"/>
+            </w:pPr>
+            <w:r>
+              <w:rPr>
+                <w:rFonts w:ascii="Times New Roman" w:hAnsi="Times New Roman"/>
+                <w:color w:val="000000"/>
+                <w:sz w:val="24"/>
+              </w:rPr>
               <w:t>R27, R25</w:t>
             </w:r>
           </w:p>
@@ -13752,7 +14472,7 @@
                 <w:color w:val="000000"/>
                 <w:sz w:val="24"/>
               </w:rPr>
-              <w:t>k adimensional; pi e yi na mesma unidade.</w:t>
+              <w:t>k: fator empírico ajustado somente com abril [1 (adimensional)]; pi: potência CA final simulada no intervalo [kW]; yi: potência CA observada no medidor no intervalo [kW]; i: índice do intervalo ou da observação na janela [1 (índice)].</w:t>
             </w:r>
           </w:p>
         </w:tc>
@@ -13772,8 +14492,9 @@
                 <w:color w:val="000000"/>
                 <w:sz w:val="24"/>
               </w:rPr>
-              <w:t>C Apoio do código</w:t>
+              <w:t>C Relação do código</w:t>
               <w:br/>
+              <w:t>Ajuste empírico separado</w:t>
             </w:r>
           </w:p>
         </w:tc>
@@ -13948,7 +14669,7 @@
                 <w:color w:val="000000"/>
                 <w:sz w:val="24"/>
               </w:rPr>
-              <w:t>Potências na mesma unidade; k fixado no mês de ajuste.</w:t>
+              <w:t>pi,emp: potência simulada após fator empírico de abril [kW]; k: fator empírico ajustado somente com abril [1 (adimensional)]; pi: potência CA final simulada no intervalo [kW]; i: índice do intervalo ou da observação na janela [1 (índice)].</w:t>
             </w:r>
           </w:p>
         </w:tc>
@@ -13968,8 +14689,9 @@
                 <w:color w:val="000000"/>
                 <w:sz w:val="24"/>
               </w:rPr>
-              <w:t>C Apoio do código</w:t>
+              <w:t>C Relação do código</w:t>
               <w:br/>
+              <w:t>Ajuste empírico separado</w:t>
             </w:r>
           </w:p>
         </w:tc>
@@ -14139,7 +14861,7 @@
                 <w:color w:val="000000"/>
                 <w:sz w:val="24"/>
               </w:rPr>
-              <w:t>α absortância; ρs refletância; τs transmitância solar; frações.</w:t>
+              <w:t>α: absortância solar assumida do elemento BIPV [1 (adimensional)]; ρs: refletância solar assumida do elemento BIPV [1 (adimensional)]; τs: transmitância solar assumida, distinta da visível [1 (adimensional)].</w:t>
             </w:r>
           </w:p>
         </w:tc>
@@ -14159,8 +14881,22 @@
                 <w:color w:val="000000"/>
                 <w:sz w:val="24"/>
               </w:rPr>
-              <w:t>C Apoio do código</w:t>
+              <w:t>C Relação do código</w:t>
               <w:br/>
+              <w:t>Balanço BIPV hipotético</w:t>
+            </w:r>
+          </w:p>
+          <w:p>
+            <w:pPr>
+              <w:spacing w:after="40" w:before="0" w:line="240" w:lineRule="auto"/>
+              <w:ind w:firstLine="0"/>
+            </w:pPr>
+            <w:r>
+              <w:rPr>
+                <w:rFonts w:ascii="Times New Roman" w:hAnsi="Times New Roman"/>
+                <w:color w:val="000000"/>
+                <w:sz w:val="24"/>
+              </w:rPr>
               <w:t>R14, R19, R20</w:t>
             </w:r>
           </w:p>
@@ -14314,7 +15050,7 @@
                 <w:color w:val="000000"/>
                 <w:sz w:val="24"/>
               </w:rPr>
-              <w:t>G em W/m²; A em m²; Pinc em W.</w:t>
+              <w:t>Pinc: potência solar incidente no elemento BIPV [W]; G: irradiância transposta no plano BIPV hipotético [W/m²]; A: área do elemento BIPV assumido; 100 [m²].</w:t>
             </w:r>
           </w:p>
         </w:tc>
@@ -14334,8 +15070,22 @@
                 <w:color w:val="000000"/>
                 <w:sz w:val="24"/>
               </w:rPr>
-              <w:t>C Apoio do código</w:t>
+              <w:t>C Relação do código</w:t>
               <w:br/>
+              <w:t>Balanço BIPV hipotético</w:t>
+            </w:r>
+          </w:p>
+          <w:p>
+            <w:pPr>
+              <w:spacing w:after="40" w:before="0" w:line="240" w:lineRule="auto"/>
+              <w:ind w:firstLine="0"/>
+            </w:pPr>
+            <w:r>
+              <w:rPr>
+                <w:rFonts w:ascii="Times New Roman" w:hAnsi="Times New Roman"/>
+                <w:color w:val="000000"/>
+                <w:sz w:val="24"/>
+              </w:rPr>
               <w:t>R14, R19, R20</w:t>
             </w:r>
           </w:p>
@@ -14509,7 +15259,7 @@
                 <w:color w:val="000000"/>
                 <w:sz w:val="24"/>
               </w:rPr>
-              <w:t>Pref em W.</w:t>
+              <w:t>Pref: potência solar refletida pelo elemento BIPV [W]; ρs: refletância solar assumida do elemento BIPV [1 (adimensional)]; G: irradiância transposta no plano BIPV hipotético [W/m²]; A: área do elemento BIPV assumido; 100 [m²].</w:t>
             </w:r>
           </w:p>
         </w:tc>
@@ -14529,8 +15279,22 @@
                 <w:color w:val="000000"/>
                 <w:sz w:val="24"/>
               </w:rPr>
-              <w:t>C Apoio do código</w:t>
+              <w:t>C Relação do código</w:t>
               <w:br/>
+              <w:t>Balanço BIPV hipotético</w:t>
+            </w:r>
+          </w:p>
+          <w:p>
+            <w:pPr>
+              <w:spacing w:after="40" w:before="0" w:line="240" w:lineRule="auto"/>
+              <w:ind w:firstLine="0"/>
+            </w:pPr>
+            <w:r>
+              <w:rPr>
+                <w:rFonts w:ascii="Times New Roman" w:hAnsi="Times New Roman"/>
+                <w:color w:val="000000"/>
+                <w:sz w:val="24"/>
+              </w:rPr>
               <w:t>R14, R19, R20</w:t>
             </w:r>
           </w:p>
@@ -14724,7 +15488,7 @@
                 <w:color w:val="000000"/>
                 <w:sz w:val="24"/>
               </w:rPr>
-              <w:t>Ptrans em W; τs solar difere da transmitância visível.</w:t>
+              <w:t>Ptrans: potência solar transmitida pelo elemento BIPV [W]; τs: transmitância solar assumida, distinta da visível [1 (adimensional)]; G: irradiância transposta no plano BIPV hipotético [W/m²]; A: área do elemento BIPV assumido; 100 [m²].</w:t>
             </w:r>
           </w:p>
         </w:tc>
@@ -14744,8 +15508,22 @@
                 <w:color w:val="000000"/>
                 <w:sz w:val="24"/>
               </w:rPr>
-              <w:t>C Apoio do código</w:t>
+              <w:t>C Relação do código</w:t>
               <w:br/>
+              <w:t>Balanço BIPV hipotético</w:t>
+            </w:r>
+          </w:p>
+          <w:p>
+            <w:pPr>
+              <w:spacing w:after="40" w:before="0" w:line="240" w:lineRule="auto"/>
+              <w:ind w:firstLine="0"/>
+            </w:pPr>
+            <w:r>
+              <w:rPr>
+                <w:rFonts w:ascii="Times New Roman" w:hAnsi="Times New Roman"/>
+                <w:color w:val="000000"/>
+                <w:sz w:val="24"/>
+              </w:rPr>
               <w:t>R14, R19, R20</w:t>
             </w:r>
           </w:p>
@@ -14837,25 +15615,132 @@
                 </m:rPr>
                 <m:t>max</m:t>
               </m:r>
+              <m:r>
+                <w:rPr>
+                  <w:rFonts w:ascii="Cambria Math" w:hAnsi="Cambria Math"/>
+                  <w:sz w:val="26"/>
+                </w:rPr>
+                <m:rPr>
+                  <m:sty m:val="p"/>
+                </m:rPr>
+                <m:t>[</m:t>
+              </m:r>
+              <m:sSub>
+                <m:e>
+                  <m:r>
+                    <w:rPr>
+                      <w:rFonts w:ascii="Cambria Math" w:hAnsi="Cambria Math"/>
+                      <w:sz w:val="26"/>
+                    </w:rPr>
+                    <m:t>η</m:t>
+                  </m:r>
+                </m:e>
+                <m:sub>
+                  <m:r>
+                    <w:rPr>
+                      <w:rFonts w:ascii="Cambria Math" w:hAnsi="Cambria Math"/>
+                      <w:sz w:val="26"/>
+                    </w:rPr>
+                    <m:rPr>
+                      <m:sty m:val="p"/>
+                    </m:rPr>
+                    <m:t>r</m:t>
+                  </m:r>
+                  <m:r>
+                    <w:rPr>
+                      <w:rFonts w:ascii="Cambria Math" w:hAnsi="Cambria Math"/>
+                      <w:sz w:val="26"/>
+                    </w:rPr>
+                    <m:rPr>
+                      <m:sty m:val="p"/>
+                    </m:rPr>
+                    <m:t>e</m:t>
+                  </m:r>
+                  <m:r>
+                    <w:rPr>
+                      <w:rFonts w:ascii="Cambria Math" w:hAnsi="Cambria Math"/>
+                      <w:sz w:val="26"/>
+                    </w:rPr>
+                    <m:rPr>
+                      <m:sty m:val="p"/>
+                    </m:rPr>
+                    <m:t>f</m:t>
+                  </m:r>
+                </m:sub>
+              </m:sSub>
               <m:d>
                 <m:dPr>
-                  <m:begChr m:val="["/>
-                  <m:endChr m:val="]"/>
+                  <m:begChr m:val="("/>
+                  <m:endChr m:val=")"/>
                   <m:sepChr m:val=""/>
                   <m:grow/>
                 </m:dPr>
                 <m:e>
-                  <m:sSub>
+                  <m:r>
+                    <w:rPr>
+                      <w:rFonts w:ascii="Cambria Math" w:hAnsi="Cambria Math"/>
+                      <w:sz w:val="26"/>
+                    </w:rPr>
+                    <m:t>1</m:t>
+                  </m:r>
+                  <m:r>
+                    <w:rPr>
+                      <w:rFonts w:ascii="Cambria Math" w:hAnsi="Cambria Math"/>
+                      <w:sz w:val="26"/>
+                    </w:rPr>
+                    <m:rPr>
+                      <m:sty m:val="p"/>
+                    </m:rPr>
+                    <m:t>+</m:t>
+                  </m:r>
+                  <m:r>
+                    <w:rPr>
+                      <w:rFonts w:ascii="Cambria Math" w:hAnsi="Cambria Math"/>
+                      <w:sz w:val="26"/>
+                    </w:rPr>
+                    <m:t>γ</m:t>
+                  </m:r>
+                  <m:d>
+                    <m:dPr>
+                      <m:begChr m:val="("/>
+                      <m:endChr m:val=")"/>
+                      <m:sepChr m:val=""/>
+                      <m:grow/>
+                    </m:dPr>
                     <m:e>
-                      <m:r>
-                        <w:rPr>
-                          <w:rFonts w:ascii="Cambria Math" w:hAnsi="Cambria Math"/>
-                          <w:sz w:val="26"/>
-                        </w:rPr>
-                        <m:t>η</m:t>
-                      </m:r>
-                    </m:e>
-                    <m:sub>
+                      <m:sSub>
+                        <m:e>
+                          <m:r>
+                            <w:rPr>
+                              <w:rFonts w:ascii="Cambria Math" w:hAnsi="Cambria Math"/>
+                              <w:sz w:val="26"/>
+                            </w:rPr>
+                            <m:t>T</m:t>
+                          </m:r>
+                        </m:e>
+                        <m:sub>
+                          <m:r>
+                            <w:rPr>
+                              <w:rFonts w:ascii="Cambria Math" w:hAnsi="Cambria Math"/>
+                              <w:sz w:val="26"/>
+                            </w:rPr>
+                            <m:rPr>
+                              <m:sty m:val="p"/>
+                            </m:rPr>
+                            <m:t>o</m:t>
+                          </m:r>
+                          <m:r>
+                            <w:rPr>
+                              <w:rFonts w:ascii="Cambria Math" w:hAnsi="Cambria Math"/>
+                              <w:sz w:val="26"/>
+                            </w:rPr>
+                            <m:rPr>
+                              <m:sty m:val="p"/>
+                            </m:rPr>
+                            <m:t>p</m:t>
+                          </m:r>
+                        </m:sub>
+                      </m:sSub>
                       <m:r>
                         <w:rPr>
                           <w:rFonts w:ascii="Cambria Math" w:hAnsi="Cambria Math"/>
@@ -14864,143 +15749,46 @@
                         <m:rPr>
                           <m:sty m:val="p"/>
                         </m:rPr>
-                        <m:t>r</m:t>
+                        <m:t>−</m:t>
                       </m:r>
                       <m:r>
                         <w:rPr>
                           <w:rFonts w:ascii="Cambria Math" w:hAnsi="Cambria Math"/>
                           <w:sz w:val="26"/>
                         </w:rPr>
-                        <m:rPr>
-                          <m:sty m:val="p"/>
-                        </m:rPr>
-                        <m:t>e</m:t>
+                        <m:t>25</m:t>
                       </m:r>
-                      <m:r>
-                        <w:rPr>
-                          <w:rFonts w:ascii="Cambria Math" w:hAnsi="Cambria Math"/>
-                          <w:sz w:val="26"/>
-                        </w:rPr>
-                        <m:rPr>
-                          <m:sty m:val="p"/>
-                        </m:rPr>
-                        <m:t>f</m:t>
-                      </m:r>
-                    </m:sub>
-                  </m:sSub>
-                  <m:d>
-                    <m:dPr>
-                      <m:begChr m:val="("/>
-                      <m:endChr m:val=")"/>
-                      <m:sepChr m:val=""/>
-                      <m:grow/>
-                    </m:dPr>
-                    <m:e>
-                      <m:r>
-                        <w:rPr>
-                          <w:rFonts w:ascii="Cambria Math" w:hAnsi="Cambria Math"/>
-                          <w:sz w:val="26"/>
-                        </w:rPr>
-                        <m:t>1</m:t>
-                      </m:r>
-                      <m:r>
-                        <w:rPr>
-                          <w:rFonts w:ascii="Cambria Math" w:hAnsi="Cambria Math"/>
-                          <w:sz w:val="26"/>
-                        </w:rPr>
-                        <m:rPr>
-                          <m:sty m:val="p"/>
-                        </m:rPr>
-                        <m:t>+</m:t>
-                      </m:r>
-                      <m:r>
-                        <w:rPr>
-                          <w:rFonts w:ascii="Cambria Math" w:hAnsi="Cambria Math"/>
-                          <w:sz w:val="26"/>
-                        </w:rPr>
-                        <m:t>γ</m:t>
-                      </m:r>
-                      <m:d>
-                        <m:dPr>
-                          <m:begChr m:val="("/>
-                          <m:endChr m:val=")"/>
-                          <m:sepChr m:val=""/>
-                          <m:grow/>
-                        </m:dPr>
-                        <m:e>
-                          <m:sSub>
-                            <m:e>
-                              <m:r>
-                                <w:rPr>
-                                  <w:rFonts w:ascii="Cambria Math" w:hAnsi="Cambria Math"/>
-                                  <w:sz w:val="26"/>
-                                </w:rPr>
-                                <m:t>T</m:t>
-                              </m:r>
-                            </m:e>
-                            <m:sub>
-                              <m:r>
-                                <w:rPr>
-                                  <w:rFonts w:ascii="Cambria Math" w:hAnsi="Cambria Math"/>
-                                  <w:sz w:val="26"/>
-                                </w:rPr>
-                                <m:rPr>
-                                  <m:sty m:val="p"/>
-                                </m:rPr>
-                                <m:t>o</m:t>
-                              </m:r>
-                              <m:r>
-                                <w:rPr>
-                                  <w:rFonts w:ascii="Cambria Math" w:hAnsi="Cambria Math"/>
-                                  <w:sz w:val="26"/>
-                                </w:rPr>
-                                <m:rPr>
-                                  <m:sty m:val="p"/>
-                                </m:rPr>
-                                <m:t>p</m:t>
-                              </m:r>
-                            </m:sub>
-                          </m:sSub>
-                          <m:r>
-                            <w:rPr>
-                              <w:rFonts w:ascii="Cambria Math" w:hAnsi="Cambria Math"/>
-                              <w:sz w:val="26"/>
-                            </w:rPr>
-                            <m:rPr>
-                              <m:sty m:val="p"/>
-                            </m:rPr>
-                            <m:t>−</m:t>
-                          </m:r>
-                          <m:r>
-                            <w:rPr>
-                              <w:rFonts w:ascii="Cambria Math" w:hAnsi="Cambria Math"/>
-                              <w:sz w:val="26"/>
-                            </w:rPr>
-                            <m:t>25</m:t>
-                          </m:r>
-                        </m:e>
-                      </m:d>
                     </m:e>
                   </m:d>
-                  <m:r>
-                    <w:rPr>
-                      <w:rFonts w:ascii="Cambria Math" w:hAnsi="Cambria Math"/>
-                      <w:sz w:val="26"/>
-                    </w:rPr>
-                    <m:rPr>
-                      <m:sty m:val="p"/>
-                    </m:rPr>
-                    <m:t>,</m:t>
-                  </m:r>
-                  <m:r>
-                    <w:rPr>
-                      <w:rFonts w:ascii="Cambria Math" w:hAnsi="Cambria Math"/>
-                      <w:sz w:val="26"/>
-                    </w:rPr>
-                    <m:t>0</m:t>
-                  </m:r>
                 </m:e>
               </m:d>
+              <m:r>
+                <w:rPr>
+                  <w:rFonts w:ascii="Cambria Math" w:hAnsi="Cambria Math"/>
+                  <w:sz w:val="26"/>
+                </w:rPr>
+                <m:rPr>
+                  <m:sty m:val="p"/>
+                </m:rPr>
+                <m:t>,</m:t>
+              </m:r>
+              <m:r>
+                <w:rPr>
+                  <w:rFonts w:ascii="Cambria Math" w:hAnsi="Cambria Math"/>
+                  <w:sz w:val="26"/>
+                </w:rPr>
+                <m:t>0</m:t>
+              </m:r>
+              <m:r>
+                <w:rPr>
+                  <w:rFonts w:ascii="Cambria Math" w:hAnsi="Cambria Math"/>
+                  <w:sz w:val="26"/>
+                </w:rPr>
+                <m:rPr>
+                  <m:sty m:val="p"/>
+                </m:rPr>
+                <m:t>]</m:t>
+              </m:r>
               <m:r>
                 <w:rPr>
                   <w:rFonts w:ascii="Cambria Math" w:hAnsi="Cambria Math"/>
@@ -15070,7 +15858,7 @@
                 <w:color w:val="000000"/>
                 <w:sz w:val="24"/>
               </w:rPr>
-              <w:t>ηref eficiência a 25 °C; γ em °C⁻¹.</w:t>
+              <w:t>η: eficiência elétrica instantânea do balanço BIPV [1 (adimensional)]; ηref: eficiência BIPV assumida a 25 °C; 0,10 [1 (adimensional)]; γ: coeficiente térmico BIPV assumido; −0,0044 [°C⁻¹]; Top: temperatura de Faiman do cenário BIPV [°C]; α: absortância solar assumida do elemento BIPV [1 (adimensional)].</w:t>
             </w:r>
           </w:p>
         </w:tc>
@@ -15090,8 +15878,22 @@
                 <w:color w:val="000000"/>
                 <w:sz w:val="24"/>
               </w:rPr>
-              <w:t>C Apoio do código</w:t>
+              <w:t>C Relação do código</w:t>
               <w:br/>
+              <w:t>Balanço BIPV hipotético</w:t>
+            </w:r>
+          </w:p>
+          <w:p>
+            <w:pPr>
+              <w:spacing w:after="40" w:before="0" w:line="240" w:lineRule="auto"/>
+              <w:ind w:firstLine="0"/>
+            </w:pPr>
+            <w:r>
+              <w:rPr>
+                <w:rFonts w:ascii="Times New Roman" w:hAnsi="Times New Roman"/>
+                <w:color w:val="000000"/>
+                <w:sz w:val="24"/>
+              </w:rPr>
               <w:t>R14, R19, R20</w:t>
             </w:r>
           </w:p>
@@ -15229,7 +16031,7 @@
                 <w:color w:val="000000"/>
                 <w:sz w:val="24"/>
               </w:rPr>
-              <w:t>η eficiência instantânea; Pe em W.</w:t>
+              <w:t>Pe: potência elétrica CC do elemento BIPV [W]; η: eficiência elétrica instantânea do balanço BIPV [1 (adimensional)]; G: irradiância transposta no plano BIPV hipotético [W/m²]; A: área do elemento BIPV assumido; 100 [m²].</w:t>
             </w:r>
           </w:p>
         </w:tc>
@@ -15249,8 +16051,22 @@
                 <w:color w:val="000000"/>
                 <w:sz w:val="24"/>
               </w:rPr>
-              <w:t>N Núcleo do notebook</w:t>
+              <w:t>N Fórmula no notebook</w:t>
               <w:br/>
+              <w:t>Balanço BIPV hipotético</w:t>
+            </w:r>
+          </w:p>
+          <w:p>
+            <w:pPr>
+              <w:spacing w:after="40" w:before="0" w:line="240" w:lineRule="auto"/>
+              <w:ind w:firstLine="0"/>
+            </w:pPr>
+            <w:r>
+              <w:rPr>
+                <w:rFonts w:ascii="Times New Roman" w:hAnsi="Times New Roman"/>
+                <w:color w:val="000000"/>
+                <w:sz w:val="24"/>
+              </w:rPr>
               <w:t>R14, R19, R20</w:t>
             </w:r>
           </w:p>
@@ -15438,7 +16254,7 @@
                 <w:color w:val="000000"/>
                 <w:sz w:val="24"/>
               </w:rPr>
-              <w:t>Qabs representa potência térmica em W apesar do símbolo Q.</w:t>
+              <w:t>Qabs: potência térmica absorvida após conversão elétrica [W]; α: absortância solar assumida do elemento BIPV [1 (adimensional)]; η: eficiência elétrica instantânea do balanço BIPV [1 (adimensional)]; G: irradiância transposta no plano BIPV hipotético [W/m²]; A: área do elemento BIPV assumido; 100 [m²].</w:t>
             </w:r>
           </w:p>
         </w:tc>
@@ -15458,8 +16274,22 @@
                 <w:color w:val="000000"/>
                 <w:sz w:val="24"/>
               </w:rPr>
-              <w:t>N Núcleo do notebook</w:t>
+              <w:t>N Fórmula no notebook</w:t>
               <w:br/>
+              <w:t>Balanço BIPV hipotético</w:t>
+            </w:r>
+          </w:p>
+          <w:p>
+            <w:pPr>
+              <w:spacing w:after="40" w:before="0" w:line="240" w:lineRule="auto"/>
+              <w:ind w:firstLine="0"/>
+            </w:pPr>
+            <w:r>
+              <w:rPr>
+                <w:rFonts w:ascii="Times New Roman" w:hAnsi="Times New Roman"/>
+                <w:color w:val="000000"/>
+                <w:sz w:val="24"/>
+              </w:rPr>
               <w:t>R14, R19, R20</w:t>
             </w:r>
           </w:p>
@@ -15702,7 +16532,7 @@
                 <w:color w:val="000000"/>
                 <w:sz w:val="24"/>
               </w:rPr>
-              <w:t>fin fração dirigida ao interior entre 0 e 1; Qout em W.</w:t>
+              <w:t>Qout: potência térmica absorvida dirigida ao exterior [W]; fin: fração do calor absorvido dirigida ao interior [1 (adimensional)]; Qabs: potência térmica absorvida após conversão elétrica [W].</w:t>
             </w:r>
           </w:p>
         </w:tc>
@@ -15722,8 +16552,22 @@
                 <w:color w:val="000000"/>
                 <w:sz w:val="24"/>
               </w:rPr>
-              <w:t>C Apoio do código</w:t>
+              <w:t>C Relação do código</w:t>
               <w:br/>
+              <w:t>Balanço BIPV hipotético</w:t>
+            </w:r>
+          </w:p>
+          <w:p>
+            <w:pPr>
+              <w:spacing w:after="40" w:before="0" w:line="240" w:lineRule="auto"/>
+              <w:ind w:firstLine="0"/>
+            </w:pPr>
+            <w:r>
+              <w:rPr>
+                <w:rFonts w:ascii="Times New Roman" w:hAnsi="Times New Roman"/>
+                <w:color w:val="000000"/>
+                <w:sz w:val="24"/>
+              </w:rPr>
               <w:t>R14, R19, R20</w:t>
             </w:r>
           </w:p>
@@ -15973,7 +16817,7 @@
                 <w:color w:val="000000"/>
                 <w:sz w:val="24"/>
               </w:rPr>
-              <w:t>Qin é potência em W; fin fração térmica interior.</w:t>
+              <w:t>Qin: ganho solar interior; transmissão mais calor absorvido [W]; τs: transmitância solar assumida, distinta da visível [1 (adimensional)]; G: irradiância transposta no plano BIPV hipotético [W/m²]; A: área do elemento BIPV assumido; 100 [m²]; fin: fração do calor absorvido dirigida ao interior [1 (adimensional)]; Qabs: potência térmica absorvida após conversão elétrica [W].</w:t>
             </w:r>
           </w:p>
         </w:tc>
@@ -15993,8 +16837,22 @@
                 <w:color w:val="000000"/>
                 <w:sz w:val="24"/>
               </w:rPr>
-              <w:t>N Núcleo do notebook</w:t>
+              <w:t>N Fórmula no notebook</w:t>
               <w:br/>
+              <w:t>Balanço BIPV hipotético</w:t>
+            </w:r>
+          </w:p>
+          <w:p>
+            <w:pPr>
+              <w:spacing w:after="40" w:before="0" w:line="240" w:lineRule="auto"/>
+              <w:ind w:firstLine="0"/>
+            </w:pPr>
+            <w:r>
+              <w:rPr>
+                <w:rFonts w:ascii="Times New Roman" w:hAnsi="Times New Roman"/>
+                <w:color w:val="000000"/>
+                <w:sz w:val="24"/>
+              </w:rPr>
               <w:t>R14, R19, R20</w:t>
             </w:r>
           </w:p>
@@ -16242,7 +17100,7 @@
                 <w:color w:val="000000"/>
                 <w:sz w:val="24"/>
               </w:rPr>
-              <w:t>SHGCeq adimensional; não equivale a certificação de produto.</w:t>
+              <w:t>SHGCeq: coeficiente equivalente do ganho solar simplificado [1 (adimensional)]; τs: transmitância solar assumida, distinta da visível [1 (adimensional)]; fin: fração do calor absorvido dirigida ao interior [1 (adimensional)]; α: absortância solar assumida do elemento BIPV [1 (adimensional)]; η: eficiência elétrica instantânea do balanço BIPV [1 (adimensional)].</w:t>
             </w:r>
           </w:p>
         </w:tc>
@@ -16262,8 +17120,22 @@
                 <w:color w:val="000000"/>
                 <w:sz w:val="24"/>
               </w:rPr>
-              <w:t>N Núcleo do notebook</w:t>
+              <w:t>N Fórmula no notebook</w:t>
               <w:br/>
+              <w:t>Balanço BIPV hipotético</w:t>
+            </w:r>
+          </w:p>
+          <w:p>
+            <w:pPr>
+              <w:spacing w:after="40" w:before="0" w:line="240" w:lineRule="auto"/>
+              <w:ind w:firstLine="0"/>
+            </w:pPr>
+            <w:r>
+              <w:rPr>
+                <w:rFonts w:ascii="Times New Roman" w:hAnsi="Times New Roman"/>
+                <w:color w:val="000000"/>
+                <w:sz w:val="24"/>
+              </w:rPr>
               <w:t>R14, R19, R20</w:t>
             </w:r>
           </w:p>
@@ -16688,7 +17560,7 @@
                 <w:color w:val="000000"/>
                 <w:sz w:val="24"/>
               </w:rPr>
-              <w:t>Todos os termos em W; o código testa o resíduo de fechamento.</w:t>
+              <w:t>Pinc: potência solar incidente no elemento BIPV [W]; Pref: potência solar refletida pelo elemento BIPV [W]; Ptrans: potência solar transmitida pelo elemento BIPV [W]; Pe: potência elétrica CC do elemento BIPV [W]; fin: fração do calor absorvido dirigida ao interior [1 (adimensional)]; Qabs: potência térmica absorvida após conversão elétrica [W]; Qout: potência térmica absorvida dirigida ao exterior [W].</w:t>
             </w:r>
           </w:p>
         </w:tc>
@@ -16708,8 +17580,22 @@
                 <w:color w:val="000000"/>
                 <w:sz w:val="24"/>
               </w:rPr>
-              <w:t>C Apoio do código</w:t>
+              <w:t>C Relação do código</w:t>
               <w:br/>
+              <w:t>Balanço BIPV hipotético</w:t>
+            </w:r>
+          </w:p>
+          <w:p>
+            <w:pPr>
+              <w:spacing w:after="40" w:before="0" w:line="240" w:lineRule="auto"/>
+              <w:ind w:firstLine="0"/>
+            </w:pPr>
+            <w:r>
+              <w:rPr>
+                <w:rFonts w:ascii="Times New Roman" w:hAnsi="Times New Roman"/>
+                <w:color w:val="000000"/>
+                <w:sz w:val="24"/>
+              </w:rPr>
               <w:t>R14, R19, R20</w:t>
             </w:r>
           </w:p>
@@ -16731,7 +17617,57 @@
     </w:p>
     <w:p>
       <w:r>
-        <w:t>Usar o mesmo plano, intervalo e máscara temporal nas comparações. G designa irradiância; H irradiação; P potência e E energia. As temperaturas são expressas em °C; diferenças de temperatura também podem ser expressas em K. Os ângulos devem seguir uma convenção única de azimute.</w:t>
+        <w:t>Usar o mesmo plano, intervalo e máscara temporal nas comparações. G designa irradiância; H irradiação; P potência e E energia. Cada linha define todas as variáveis da relação. i indexa intervalos ou observações; j indexa perdas ou estágios conforme a linha. As operações soma, produto, média, valor absoluto, mínimo e máximo não são novas variáveis.</w:t>
+      </w:r>
+    </w:p>
+    <w:p>
+      <w:r>
+        <w:t>Ângulos são declarados em graus. Rotinas trigonométricas que recebem radianos exigem conversão. Azimutes partem do norte no sentido horário.</w:t>
+      </w:r>
+    </w:p>
+    <w:p>
+      <w:r>
+        <w:t>Em E1.04, G em W/m² e Δt em h produzem H em Wh/m²; o código divide por 1000 para kWh/m². Em E3.18, P em kW produz E em kWh; o código converte suas séries W por /1000.</w:t>
+      </w:r>
+    </w:p>
+    <w:p>
+      <w:r>
+        <w:t>Em E3.06, 1000 representa Gref=1000 W/m² e 25 representa 25 °C. Em E4.24, 25 também representa 25 °C. Os coeficientes da curva E3.14 são adimensionais.</w:t>
+      </w:r>
+    </w:p>
+    <w:p>
+      <w:r>
+        <w:t>U0 tem unidade W/(m²·K) e U1 tem W·s/(m³·K), de modo que Gef/(U0+U1v) é diferença de temperatura em K, numericamente igual a °C.</w:t>
+      </w:r>
+    </w:p>
+    <w:p>
+      <w:r>
+        <w:t>P0 é 893000 W em E4.03 e 893 kWp nos indicadores. Gref é 1000 W/m² na potência e 1 kW/m² na produtividade de referência.</w:t>
+      </w:r>
+    </w:p>
+    <w:p>
+      <w:r>
+        <w:t>ηref=0,9637 é referência da curva do inversor em E3.14; ηref=0,10 é hipótese de eficiência BIPV em E4.24. γ vem do módulo CEC em E3.06 e é assumido −0,0044 °C⁻¹ em E4.24.</w:t>
+      </w:r>
+    </w:p>
+    <w:p>
+      <w:r>
+        <w:t>Pa em E3.09 refere-se ao exemplo de 120 módulos; Pa em E3.10 é a potência bruta dos 2880 módulos do sistema. A associação 20×6 não comprova o cabeamento real.</w:t>
+      </w:r>
+    </w:p>
+    <w:p>
+      <w:r>
+        <w:t>Qabs, Qin e Qout no balanço BIPV designam potências em W. A integração dessas séries fornece energia; Q não representa joules nessas equações.</w:t>
+      </w:r>
+    </w:p>
+    <w:p>
+      <w:r>
+        <w:t>Nas métricas locais de potência, p, y e e estão em kW; metrics é genérica e conserva a unidade das séries recebidas. O ajuste k é calculado em W no código e é invariável sob conversão comum para kW.</w:t>
+      </w:r>
+    </w:p>
+    <w:p>
+      <w:r>
+        <w:t>Cada linha conta uma relação. Constantes e parâmetros não entram na contagem. Os itens N são o núcleo editorial já escrito e os C detalham o método; selecionar a inclusão conforme a discussão e o espaço. A numeração final do capítulo será definida na consolidação.</w:t>
       </w:r>
     </w:p>
     <w:p>
@@ -16824,7 +17760,7 @@
     </w:p>
     <w:p>
       <w:r>
-        <w:t>O núcleo N foi conferido nas 19 subseções do notebook e na matriz do capítulo da revisão 17ffe0eeb7d7. A fórmula repetida em 2.1 e 3.2 recebeu um só ID. Conversões de unidade, máscaras de qualidade e algoritmos internos de SPA, CEC e Perez–Driesse permanecem descritos no código e nas referências, sem numeração editorial adicional.</w:t>
+        <w:t>As fórmulas N foram conferidas nas 19 subseções do notebook e na matriz da revisão 17ffe0eeb7d7. Os algoritmos de SPA, CEC e Perez–Driesse, as conversões e os filtros estão no código. Citar as fontes R e explicitar as hipóteses na redação.</w:t>
       </w:r>
     </w:p>
     <w:p>
@@ -16835,11 +17771,6 @@
     <w:p>
       <w:r>
         <w:t>Inventário legível com localização e links: https://github.com/samuelasroma-byte/SPGER0046_Energias_Renovaveis/blob/main/docs/equacoes/README.md</w:t>
-      </w:r>
-    </w:p>
-    <w:p>
-      <w:r>
-        <w:t>Os códigos R identificam as fontes já catalogadas no projeto. As equações de apoio foram transcritas do código; para a redação científica, citar a fonte metodológica correspondente e explicitar as hipóteses do estudo.</w:t>
       </w:r>
     </w:p>
     <w:sectPr>

</xml_diff>

<commit_message>
Padronizar a redação e os documentos técnicos do capítulo
</commit_message>
<xml_diff>
--- a/docs/equacoes/Inventario_Geral_Equacoes_SPGER0046.docx
+++ b/docs/equacoes/Inventario_Geral_Equacoes_SPGER0046.docx
@@ -601,7 +601,7 @@
     </w:tbl>
     <w:p>
       <w:r>
-        <w:t>A equação de Faiman possui um único ID E3.03 e local de inserção em 3.2. Em 2.1 fazer remissão a esse ID. No inventário geral os quatro quadros são reunidos para controle; cada Word de seção contém somente os itens que lhe pertencem.</w:t>
+        <w:t xml:space="preserve">O modelo de Faiman corresponde a E3.03, na subseção 3.2; a subseção 2.1 utiliza essa referência.</w:t>
       </w:r>
     </w:p>
     <w:p>
@@ -982,7 +982,7 @@
                 <w:color w:val="000000"/>
                 <w:sz w:val="24"/>
               </w:rPr>
-              <w:t>N Fórmula no notebook</w:t>
+              <w:t>N Fórmula do notebook</w:t>
               <w:br/>
               <w:t>Fundamentação ou exemplo geométrico</w:t>
             </w:r>
@@ -1235,7 +1235,7 @@
                 <w:color w:val="000000"/>
                 <w:sz w:val="24"/>
               </w:rPr>
-              <w:t>N Fórmula no notebook</w:t>
+              <w:t>N Fórmula do notebook</w:t>
               <w:br/>
               <w:t>Geometria calculada e seleção de intervalos</w:t>
             </w:r>
@@ -1507,7 +1507,7 @@
                 <w:color w:val="000000"/>
                 <w:sz w:val="24"/>
               </w:rPr>
-              <w:t>N Fórmula no notebook</w:t>
+              <w:t>N Fórmula do notebook</w:t>
               <w:br/>
               <w:t>Fundamentação ou exemplo geométrico</w:t>
             </w:r>
@@ -1721,7 +1721,7 @@
                 <w:color w:val="000000"/>
                 <w:sz w:val="24"/>
               </w:rPr>
-              <w:t>N Fórmula no notebook</w:t>
+              <w:t>N Fórmula do notebook</w:t>
               <w:br/>
               <w:t>Integração ou estatística dos dados</w:t>
             </w:r>
@@ -2036,7 +2036,7 @@
                 <w:color w:val="000000"/>
                 <w:sz w:val="24"/>
               </w:rPr>
-              <w:t>N Fórmula no notebook</w:t>
+              <w:t>N Fórmula do notebook</w:t>
               <w:br/>
               <w:t>Integração ou estatística dos dados</w:t>
             </w:r>
@@ -2365,7 +2365,7 @@
                 <w:color w:val="000000"/>
                 <w:sz w:val="24"/>
               </w:rPr>
-              <w:t>N Fórmula no notebook</w:t>
+              <w:t>N Fórmula do notebook</w:t>
               <w:br/>
               <w:t>Integração ou estatística dos dados</w:t>
             </w:r>
@@ -3508,7 +3508,7 @@
                 <w:color w:val="000000"/>
                 <w:sz w:val="24"/>
               </w:rPr>
-              <w:t>N Fórmula no notebook</w:t>
+              <w:t>N Fórmula do notebook</w:t>
               <w:br/>
               <w:t>Transposição exploratória e cenários</w:t>
             </w:r>
@@ -3750,7 +3750,7 @@
                 <w:color w:val="000000"/>
                 <w:sz w:val="24"/>
               </w:rPr>
-              <w:t>N Fórmula no notebook</w:t>
+              <w:t>N Fórmula do notebook</w:t>
               <w:br/>
               <w:t>Conversão física principal</w:t>
             </w:r>
@@ -4086,7 +4086,7 @@
                 <w:color w:val="000000"/>
                 <w:sz w:val="24"/>
               </w:rPr>
-              <w:t>N Fórmula no notebook</w:t>
+              <w:t>N Fórmula do notebook</w:t>
               <w:br/>
               <w:t>Geometria calculada e seleção de intervalos</w:t>
             </w:r>
@@ -4275,7 +4275,7 @@
                 <w:color w:val="000000"/>
                 <w:sz w:val="24"/>
               </w:rPr>
-              <w:t>N Fórmula no notebook</w:t>
+              <w:t>N Fórmula do notebook</w:t>
               <w:br/>
               <w:t>Fundamentação ou exemplo geométrico</w:t>
             </w:r>
@@ -4802,7 +4802,7 @@
                 <w:color w:val="000000"/>
                 <w:sz w:val="24"/>
               </w:rPr>
-              <w:t>N Fórmula no notebook</w:t>
+              <w:t>N Fórmula do notebook</w:t>
               <w:br/>
               <w:t>Transposição exploratória e cenários</w:t>
             </w:r>
@@ -5467,7 +5467,7 @@
                 <w:color w:val="000000"/>
                 <w:sz w:val="24"/>
               </w:rPr>
-              <w:t>N Fórmula no notebook</w:t>
+              <w:t>N Fórmula do notebook</w:t>
               <w:br/>
               <w:t>Conversão física principal</w:t>
             </w:r>
@@ -5863,7 +5863,7 @@
                 <w:color w:val="000000"/>
                 <w:sz w:val="24"/>
               </w:rPr>
-              <w:t>N Fórmula no notebook</w:t>
+              <w:t>N Fórmula do notebook</w:t>
               <w:br/>
               <w:t>Conversão física principal</w:t>
             </w:r>
@@ -6016,7 +6016,7 @@
                 <w:color w:val="000000"/>
                 <w:sz w:val="24"/>
               </w:rPr>
-              <w:t>N Fórmula no notebook</w:t>
+              <w:t>N Fórmula do notebook</w:t>
               <w:br/>
               <w:t>Curvas ou associação elétrica ilustrativa</w:t>
             </w:r>
@@ -6687,7 +6687,7 @@
                 <w:color w:val="000000"/>
                 <w:sz w:val="24"/>
               </w:rPr>
-              <w:t>N Fórmula no notebook</w:t>
+              <w:t>N Fórmula do notebook</w:t>
               <w:br/>
               <w:t>Curvas ou associação elétrica ilustrativa</w:t>
             </w:r>
@@ -6879,7 +6879,7 @@
                 <w:color w:val="000000"/>
                 <w:sz w:val="24"/>
               </w:rPr>
-              <w:t>N Fórmula no notebook</w:t>
+              <w:t>N Fórmula do notebook</w:t>
               <w:br/>
               <w:t>Curvas ou associação elétrica ilustrativa</w:t>
             </w:r>
@@ -7091,7 +7091,7 @@
                 <w:color w:val="000000"/>
                 <w:sz w:val="24"/>
               </w:rPr>
-              <w:t>N Fórmula no notebook</w:t>
+              <w:t>N Fórmula do notebook</w:t>
               <w:br/>
               <w:t>Curvas ou associação elétrica ilustrativa</w:t>
             </w:r>
@@ -7354,7 +7354,7 @@
                 <w:color w:val="000000"/>
                 <w:sz w:val="24"/>
               </w:rPr>
-              <w:t>N Fórmula no notebook</w:t>
+              <w:t>N Fórmula do notebook</w:t>
               <w:br/>
               <w:t>Conversão física principal</w:t>
             </w:r>
@@ -7715,7 +7715,7 @@
                 <w:color w:val="000000"/>
                 <w:sz w:val="24"/>
               </w:rPr>
-              <w:t>N Fórmula no notebook</w:t>
+              <w:t>N Fórmula do notebook</w:t>
               <w:br/>
               <w:t>Conversão física principal</w:t>
             </w:r>
@@ -8056,7 +8056,7 @@
                 <w:color w:val="000000"/>
                 <w:sz w:val="24"/>
               </w:rPr>
-              <w:t>N Fórmula no notebook</w:t>
+              <w:t>N Fórmula do notebook</w:t>
               <w:br/>
               <w:t>Conversão física principal</w:t>
             </w:r>
@@ -9696,7 +9696,7 @@
                 <w:color w:val="000000"/>
                 <w:sz w:val="24"/>
               </w:rPr>
-              <w:t>N Fórmula no notebook</w:t>
+              <w:t>N Fórmula do notebook</w:t>
               <w:br/>
               <w:t>Integração ou estatística dos dados</w:t>
             </w:r>
@@ -10070,7 +10070,7 @@
                 <w:color w:val="000000"/>
                 <w:sz w:val="24"/>
               </w:rPr>
-              <w:t>N Fórmula no notebook</w:t>
+              <w:t>N Fórmula do notebook</w:t>
               <w:br/>
               <w:t>Indicadores e avaliação do modelo</w:t>
             </w:r>
@@ -10350,7 +10350,7 @@
                 <w:color w:val="000000"/>
                 <w:sz w:val="24"/>
               </w:rPr>
-              <w:t>N Fórmula no notebook</w:t>
+              <w:t>N Fórmula do notebook</w:t>
               <w:br/>
               <w:t>Indicadores e avaliação do modelo</w:t>
             </w:r>
@@ -10888,7 +10888,7 @@
                 <w:color w:val="000000"/>
                 <w:sz w:val="24"/>
               </w:rPr>
-              <w:t>N Fórmula no notebook</w:t>
+              <w:t>N Fórmula do notebook</w:t>
               <w:br/>
               <w:t>Indicadores e avaliação do modelo</w:t>
             </w:r>
@@ -11103,7 +11103,7 @@
                 <w:color w:val="000000"/>
                 <w:sz w:val="24"/>
               </w:rPr>
-              <w:t>N Fórmula no notebook</w:t>
+              <w:t>N Fórmula do notebook</w:t>
               <w:br/>
               <w:t>Indicadores e avaliação do modelo</w:t>
             </w:r>
@@ -11318,7 +11318,7 @@
                 <w:color w:val="000000"/>
                 <w:sz w:val="24"/>
               </w:rPr>
-              <w:t>N Fórmula no notebook</w:t>
+              <w:t>N Fórmula do notebook</w:t>
               <w:br/>
               <w:t>Indicadores e avaliação do modelo</w:t>
             </w:r>
@@ -11514,7 +11514,7 @@
                 <w:color w:val="000000"/>
                 <w:sz w:val="24"/>
               </w:rPr>
-              <w:t>N Fórmula no notebook</w:t>
+              <w:t>N Fórmula do notebook</w:t>
               <w:br/>
               <w:t>Indicadores e avaliação do modelo</w:t>
             </w:r>
@@ -11716,7 +11716,7 @@
                 <w:color w:val="000000"/>
                 <w:sz w:val="24"/>
               </w:rPr>
-              <w:t>N Fórmula no notebook</w:t>
+              <w:t>N Fórmula do notebook</w:t>
               <w:br/>
               <w:t>Indicadores e avaliação do modelo</w:t>
             </w:r>
@@ -11918,7 +11918,7 @@
                 <w:color w:val="000000"/>
                 <w:sz w:val="24"/>
               </w:rPr>
-              <w:t>N Fórmula no notebook</w:t>
+              <w:t>N Fórmula do notebook</w:t>
               <w:br/>
               <w:t>Indicadores e avaliação do modelo</w:t>
             </w:r>
@@ -12361,7 +12361,7 @@
                 <w:color w:val="000000"/>
                 <w:sz w:val="24"/>
               </w:rPr>
-              <w:t>N Fórmula no notebook</w:t>
+              <w:t>N Fórmula do notebook</w:t>
               <w:br/>
               <w:t>Indicadores e avaliação do modelo</w:t>
             </w:r>
@@ -12622,7 +12622,7 @@
                 <w:color w:val="000000"/>
                 <w:sz w:val="24"/>
               </w:rPr>
-              <w:t>N Fórmula no notebook</w:t>
+              <w:t>N Fórmula do notebook</w:t>
               <w:br/>
               <w:t>Indicadores e avaliação do modelo</w:t>
             </w:r>
@@ -12887,7 +12887,7 @@
                 <w:color w:val="000000"/>
                 <w:sz w:val="24"/>
               </w:rPr>
-              <w:t>N Fórmula no notebook</w:t>
+              <w:t>N Fórmula do notebook</w:t>
               <w:br/>
               <w:t>Indicadores e avaliação do modelo</w:t>
             </w:r>
@@ -14099,7 +14099,7 @@
                 <w:color w:val="000000"/>
                 <w:sz w:val="24"/>
               </w:rPr>
-              <w:t>N Fórmula no notebook</w:t>
+              <w:t>N Fórmula do notebook</w:t>
               <w:br/>
               <w:t>Indicadores e avaliação do modelo</w:t>
             </w:r>
@@ -16051,7 +16051,7 @@
                 <w:color w:val="000000"/>
                 <w:sz w:val="24"/>
               </w:rPr>
-              <w:t>N Fórmula no notebook</w:t>
+              <w:t>N Fórmula do notebook</w:t>
               <w:br/>
               <w:t>Balanço BIPV hipotético</w:t>
             </w:r>
@@ -16274,7 +16274,7 @@
                 <w:color w:val="000000"/>
                 <w:sz w:val="24"/>
               </w:rPr>
-              <w:t>N Fórmula no notebook</w:t>
+              <w:t>N Fórmula do notebook</w:t>
               <w:br/>
               <w:t>Balanço BIPV hipotético</w:t>
             </w:r>
@@ -16837,7 +16837,7 @@
                 <w:color w:val="000000"/>
                 <w:sz w:val="24"/>
               </w:rPr>
-              <w:t>N Fórmula no notebook</w:t>
+              <w:t>N Fórmula do notebook</w:t>
               <w:br/>
               <w:t>Balanço BIPV hipotético</w:t>
             </w:r>
@@ -17120,7 +17120,7 @@
                 <w:color w:val="000000"/>
                 <w:sz w:val="24"/>
               </w:rPr>
-              <w:t>N Fórmula no notebook</w:t>
+              <w:t>N Fórmula do notebook</w:t>
               <w:br/>
               <w:t>Balanço BIPV hipotético</w:t>
             </w:r>
@@ -17667,7 +17667,7 @@
     </w:p>
     <w:p>
       <w:r>
-        <w:t>Cada linha conta uma relação. Constantes e parâmetros não entram na contagem. Os itens N são o núcleo editorial já escrito e os C detalham o método; selecionar a inclusão conforme a discussão e o espaço. A numeração final do capítulo será definida na consolidação.</w:t>
+        <w:t>Cada linha conta uma relação. Constantes e parâmetros não entram na contagem. N identifica relações do notebook e C, relações complementares do código; selecionar a inclusão conforme a discussão e o espaço. A numeração final do capítulo será definida na consolidação.</w:t>
       </w:r>
     </w:p>
     <w:p>
@@ -17760,7 +17760,7 @@
     </w:p>
     <w:p>
       <w:r>
-        <w:t>As fórmulas N foram conferidas nas 19 subseções do notebook e na matriz da revisão 17ffe0eeb7d7. Os algoritmos de SPA, CEC e Perez–Driesse, as conversões e os filtros estão no código. Citar as fontes R e explicitar as hipóteses na redação.</w:t>
+        <w:t>As fórmulas N correspondem às células de método das 19 subseções do notebook. Os algoritmos de SPA, CEC e Perez–Driesse, as conversões e os filtros estão no código. Citar as fontes R e explicitar as hipóteses na redação.</w:t>
       </w:r>
     </w:p>
     <w:p>

</xml_diff>